<commit_message>
Création de comptes par téléphone, e-mail et mot de passe
- Inscription publique d'une pharmacie (POST /api/auth/register, page
  /inscription) : crée l'officine en essai et son administrateur, puis
  ouvre la session. Aucun rôle ne peut y être choisi ; fermeture par
  INSCRIPTION_PUBLIQUE=off, limite globale INSCRIPTION_LIMITE_PAR_HEURE.
- Équipe d'une pharmacie : formulaire « Ajouter un membre » ; le
  téléphone devient obligatoire à la création (CreateUserDto).
- Comptes internes : page Équipe du back-office, visible et accessible
  au seul super-administrateur ; téléphone enregistré (migration 018).
- Téléphones normalisés au format international avec l'indicatif du
  pays de la pharmacie (common/telephone.ts, partagé avec la messagerie).
- 12 tests de bout en bout (95 au total), guide et README mis à jour.

Co-Authored-By: Claude Opus 5.5 <noreply@anthropic.com>
Claude-Session: https://claude.ai/code/session_011SyBGTgTJHgxTnZbyUKDiB
</commit_message>
<xml_diff>
--- a/nova-pharma-os/docs/word/GUIDE_DEMARRAGE.docx
+++ b/nova-pharma-os/docs/word/GUIDE_DEMARRAGE.docx
@@ -1677,6 +1677,427 @@
     <w:p>
       <w:r>
         <w:t xml:space="preserve">À partir de là, l'officine tourne. Le reste — clients à crédit, livraisons, rappels WhatsApp, encaissement Mobile Money — s'ajoute quand vous en avez besoin.</w:t>
+      </w:r>
+    </w:p>
+    <w:p>
+      <w:pPr>
+        <w:pBdr>
+          <w:bottom w:val="single" w:sz="6" w:space="6" w:color="CFE0DA"/>
+        </w:pBdr>
+        <w:spacing w:before="200" w:after="200"/>
+      </w:pPr>
+    </w:p>
+    <w:p>
+      <w:pPr>
+        <w:pStyle w:val="Titre2"/>
+      </w:pPr>
+      <w:r>
+        <w:t xml:space="preserve">Créer des comptes</w:t>
+      </w:r>
+    </w:p>
+    <w:p>
+      <w:r>
+        <w:t xml:space="preserve">Chaque compte se crée avec les trois mêmes informations : </w:t>
+      </w:r>
+      <w:r>
+        <w:rPr>
+          <w:b/>
+        </w:rPr>
+        <w:t xml:space="preserve">un numéro de téléphone, une adresse e-mail et un mot de passe</w:t>
+      </w:r>
+      <w:r>
+        <w:t xml:space="preserve"> (8 caractères au minimum). On se connecte avec l'adresse e-mail ; le téléphone sert à joindre la personne. Tapez le numéro comme vous le composez — </w:t>
+      </w:r>
+      <w:r>
+        <w:rPr>
+          <w:rFonts w:ascii="Consolas" w:hAnsi="Consolas"/>
+          <w:sz w:val="19"/>
+          <w:shd w:val="clear" w:fill="EEF2F0"/>
+        </w:rPr>
+        <w:t xml:space="preserve">0991 234 567</w:t>
+      </w:r>
+      <w:r>
+        <w:t xml:space="preserve"> — : l'application ajoute d'elle-même l'indicatif du pays (+243 en RD Congo).</w:t>
+      </w:r>
+    </w:p>
+    <w:p>
+      <w:r>
+        <w:t xml:space="preserve">Qui crée quoi :</w:t>
+      </w:r>
+    </w:p>
+    <w:tbl>
+      <w:tblPr>
+        <w:tblStyle w:val="Grille"/>
+        <w:tblW w:w="5000" w:type="pct"/>
+        <w:tblBorders>
+          <w:top w:val="single" w:sz="4" w:space="0" w:color="CFE0DA"/>
+          <w:left w:val="single" w:sz="4" w:space="0" w:color="CFE0DA"/>
+          <w:bottom w:val="single" w:sz="4" w:space="0" w:color="CFE0DA"/>
+          <w:right w:val="single" w:sz="4" w:space="0" w:color="CFE0DA"/>
+          <w:insideH w:val="single" w:sz="4" w:space="0" w:color="CFE0DA"/>
+          <w:insideV w:val="single" w:sz="4" w:space="0" w:color="CFE0DA"/>
+        </w:tblBorders>
+        <w:tblCellMar>
+          <w:top w:w="60" w:type="dxa"/>
+          <w:left w:w="90" w:type="dxa"/>
+          <w:bottom w:w="60" w:type="dxa"/>
+          <w:right w:w="90" w:type="dxa"/>
+        </w:tblCellMar>
+      </w:tblPr>
+      <w:tr>
+        <w:trPr>
+          <w:tblHeader/>
+        </w:trPr>
+        <w:tc>
+          <w:tcPr>
+            <w:tcW w:w="3116" w:type="dxa"/>
+            <w:shd w:val="clear" w:fill="E8F2EE"/>
+          </w:tcPr>
+          <w:p>
+            <w:pPr>
+              <w:pStyle w:val="Cellule"/>
+            </w:pPr>
+            <w:r>
+              <w:rPr>
+                <w:b/>
+              </w:rPr>
+              <w:t xml:space="preserve">Compte</w:t>
+            </w:r>
+          </w:p>
+        </w:tc>
+        <w:tc>
+          <w:tcPr>
+            <w:tcW w:w="3116" w:type="dxa"/>
+            <w:shd w:val="clear" w:fill="E8F2EE"/>
+          </w:tcPr>
+          <w:p>
+            <w:pPr>
+              <w:pStyle w:val="Cellule"/>
+            </w:pPr>
+            <w:r>
+              <w:rPr>
+                <w:b/>
+              </w:rPr>
+              <w:t xml:space="preserve">Qui le crée</w:t>
+            </w:r>
+          </w:p>
+        </w:tc>
+        <w:tc>
+          <w:tcPr>
+            <w:tcW w:w="3116" w:type="dxa"/>
+            <w:shd w:val="clear" w:fill="E8F2EE"/>
+          </w:tcPr>
+          <w:p>
+            <w:pPr>
+              <w:pStyle w:val="Cellule"/>
+            </w:pPr>
+            <w:r>
+              <w:rPr>
+                <w:b/>
+              </w:rPr>
+              <w:t xml:space="preserve">Où</w:t>
+            </w:r>
+          </w:p>
+        </w:tc>
+      </w:tr>
+      <w:tr>
+        <w:tc>
+          <w:tcPr>
+            <w:tcW w:w="3116" w:type="dxa"/>
+          </w:tcPr>
+          <w:p>
+            <w:pPr>
+              <w:pStyle w:val="Cellule"/>
+            </w:pPr>
+            <w:r>
+              <w:rPr>
+                <w:b/>
+              </w:rPr>
+              <w:t xml:space="preserve">Une nouvelle pharmacie</w:t>
+            </w:r>
+            <w:r>
+              <w:t xml:space="preserve"> et son administrateur</w:t>
+            </w:r>
+          </w:p>
+        </w:tc>
+        <w:tc>
+          <w:tcPr>
+            <w:tcW w:w="3116" w:type="dxa"/>
+          </w:tcPr>
+          <w:p>
+            <w:pPr>
+              <w:pStyle w:val="Cellule"/>
+            </w:pPr>
+            <w:r>
+              <w:t xml:space="preserve">La personne elle-même</w:t>
+            </w:r>
+          </w:p>
+        </w:tc>
+        <w:tc>
+          <w:tcPr>
+            <w:tcW w:w="3116" w:type="dxa"/>
+          </w:tcPr>
+          <w:p>
+            <w:pPr>
+              <w:pStyle w:val="Cellule"/>
+            </w:pPr>
+            <w:r>
+              <w:t xml:space="preserve">Page de connexion → </w:t>
+            </w:r>
+            <w:r>
+              <w:rPr>
+                <w:i/>
+              </w:rPr>
+              <w:t xml:space="preserve">Créer un compte</w:t>
+            </w:r>
+          </w:p>
+        </w:tc>
+      </w:tr>
+      <w:tr>
+        <w:tc>
+          <w:tcPr>
+            <w:tcW w:w="3116" w:type="dxa"/>
+          </w:tcPr>
+          <w:p>
+            <w:pPr>
+              <w:pStyle w:val="Cellule"/>
+            </w:pPr>
+            <w:r>
+              <w:rPr>
+                <w:b/>
+              </w:rPr>
+              <w:t xml:space="preserve">Un membre de l'équipe</w:t>
+            </w:r>
+            <w:r>
+              <w:t xml:space="preserve"> (vendeur, caissier, livreur…)</w:t>
+            </w:r>
+          </w:p>
+        </w:tc>
+        <w:tc>
+          <w:tcPr>
+            <w:tcW w:w="3116" w:type="dxa"/>
+          </w:tcPr>
+          <w:p>
+            <w:pPr>
+              <w:pStyle w:val="Cellule"/>
+            </w:pPr>
+            <w:r>
+              <w:t xml:space="preserve">L'administrateur de la pharmacie</w:t>
+            </w:r>
+          </w:p>
+        </w:tc>
+        <w:tc>
+          <w:tcPr>
+            <w:tcW w:w="3116" w:type="dxa"/>
+          </w:tcPr>
+          <w:p>
+            <w:pPr>
+              <w:pStyle w:val="Cellule"/>
+            </w:pPr>
+            <w:r>
+              <w:t xml:space="preserve">Espace pharmacie → </w:t>
+            </w:r>
+            <w:r>
+              <w:rPr>
+                <w:i/>
+              </w:rPr>
+              <w:t xml:space="preserve">Équipe</w:t>
+            </w:r>
+            <w:r>
+              <w:t xml:space="preserve"> → </w:t>
+            </w:r>
+            <w:r>
+              <w:rPr>
+                <w:i/>
+              </w:rPr>
+              <w:t xml:space="preserve">Ajouter un membre</w:t>
+            </w:r>
+          </w:p>
+        </w:tc>
+      </w:tr>
+      <w:tr>
+        <w:tc>
+          <w:tcPr>
+            <w:tcW w:w="3116" w:type="dxa"/>
+          </w:tcPr>
+          <w:p>
+            <w:pPr>
+              <w:pStyle w:val="Cellule"/>
+            </w:pPr>
+            <w:r>
+              <w:rPr>
+                <w:b/>
+              </w:rPr>
+              <w:t xml:space="preserve">Un compte interne</w:t>
+            </w:r>
+            <w:r>
+              <w:t xml:space="preserve"> NOVA PHARMA OS (support, commercial, super-administrateur)</w:t>
+            </w:r>
+          </w:p>
+        </w:tc>
+        <w:tc>
+          <w:tcPr>
+            <w:tcW w:w="3116" w:type="dxa"/>
+          </w:tcPr>
+          <w:p>
+            <w:pPr>
+              <w:pStyle w:val="Cellule"/>
+            </w:pPr>
+            <w:r>
+              <w:t xml:space="preserve">Un super-administrateur uniquement</w:t>
+            </w:r>
+          </w:p>
+        </w:tc>
+        <w:tc>
+          <w:tcPr>
+            <w:tcW w:w="3116" w:type="dxa"/>
+          </w:tcPr>
+          <w:p>
+            <w:pPr>
+              <w:pStyle w:val="Cellule"/>
+            </w:pPr>
+            <w:r>
+              <w:t xml:space="preserve">Back-office → </w:t>
+            </w:r>
+            <w:r>
+              <w:rPr>
+                <w:i/>
+              </w:rPr>
+              <w:t xml:space="preserve">Équipe</w:t>
+            </w:r>
+          </w:p>
+        </w:tc>
+      </w:tr>
+    </w:tbl>
+    <w:p>
+      <w:pPr>
+        <w:spacing w:after="120"/>
+      </w:pPr>
+    </w:p>
+    <w:p>
+      <w:r>
+        <w:rPr>
+          <w:b/>
+        </w:rPr>
+        <w:t xml:space="preserve">Une nouvelle pharmacie.</w:t>
+      </w:r>
+      <w:r>
+        <w:t xml:space="preserve"> Sur la page de connexion, cliquez sur </w:t>
+      </w:r>
+      <w:r>
+        <w:rPr>
+          <w:i/>
+        </w:rPr>
+        <w:t xml:space="preserve">Créer un compte</w:t>
+      </w:r>
+      <w:r>
+        <w:t xml:space="preserve">. Indiquez le nom de l'officine, votre nom, votre téléphone, votre adresse e-mail et votre mot de passe (deux fois). La pharmacie est créée en période d'essai, vous en êtes l'administrateur, et vous entrez directement dans votre espace.</w:t>
+      </w:r>
+    </w:p>
+    <w:p>
+      <w:r>
+        <w:rPr>
+          <w:b/>
+        </w:rPr>
+        <w:t xml:space="preserve">Un membre de l'équipe.</w:t>
+      </w:r>
+      <w:r>
+        <w:t xml:space="preserve"> Ouvrez </w:t>
+      </w:r>
+      <w:r>
+        <w:rPr>
+          <w:i/>
+        </w:rPr>
+        <w:t xml:space="preserve">Équipe</w:t>
+      </w:r>
+      <w:r>
+        <w:t xml:space="preserve">, remplissez </w:t>
+      </w:r>
+      <w:r>
+        <w:rPr>
+          <w:i/>
+        </w:rPr>
+        <w:t xml:space="preserve">Ajouter un membre</w:t>
+      </w:r>
+      <w:r>
+        <w:t xml:space="preserve">, choisissez son rôle, puis </w:t>
+      </w:r>
+      <w:r>
+        <w:rPr>
+          <w:i/>
+        </w:rPr>
+        <w:t xml:space="preserve">Créer le compte</w:t>
+      </w:r>
+      <w:r>
+        <w:t xml:space="preserve">. Donnez-lui son mot de passe </w:t>
+      </w:r>
+      <w:r>
+        <w:rPr>
+          <w:b/>
+        </w:rPr>
+        <w:t xml:space="preserve">de vive voix</w:t>
+      </w:r>
+      <w:r>
+        <w:t xml:space="preserve">, jamais par écrit.</w:t>
+      </w:r>
+    </w:p>
+    <w:p>
+      <w:r>
+        <w:rPr>
+          <w:b/>
+        </w:rPr>
+        <w:t xml:space="preserve">Un compte interne.</w:t>
+      </w:r>
+      <w:r>
+        <w:t xml:space="preserve"> Ces comptes voient toutes les pharmacies clientes : il n'existe donc </w:t>
+      </w:r>
+      <w:r>
+        <w:rPr>
+          <w:b/>
+        </w:rPr>
+        <w:t xml:space="preserve">aucune inscription publique</w:t>
+      </w:r>
+      <w:r>
+        <w:t xml:space="preserve"> pour eux. Seul un super-administrateur les crée, depuis le menu </w:t>
+      </w:r>
+      <w:r>
+        <w:rPr>
+          <w:i/>
+        </w:rPr>
+        <w:t xml:space="preserve">Équipe</w:t>
+      </w:r>
+      <w:r>
+        <w:t xml:space="preserve"> du back-office — le menu n'apparaît même pas pour les autres rôles.</w:t>
+      </w:r>
+    </w:p>
+    <w:p>
+      <w:pPr>
+        <w:pStyle w:val="Citation"/>
+      </w:pPr>
+      <w:r>
+        <w:t xml:space="preserve">Pour fermer l'inscription publique (par exemple avant un lancement), démarrez l'API avec </w:t>
+      </w:r>
+      <w:r>
+        <w:rPr>
+          <w:rFonts w:ascii="Consolas" w:hAnsi="Consolas"/>
+          <w:sz w:val="19"/>
+          <w:shd w:val="clear" w:fill="EEF2F0"/>
+        </w:rPr>
+        <w:t xml:space="preserve">INSCRIPTION_PUBLIQUE=off</w:t>
+      </w:r>
+      <w:r>
+        <w:t xml:space="preserve">. Par sécurité, les inscriptions sont aussi limitées à 20 par heure (</w:t>
+      </w:r>
+      <w:r>
+        <w:rPr>
+          <w:rFonts w:ascii="Consolas" w:hAnsi="Consolas"/>
+          <w:sz w:val="19"/>
+          <w:shd w:val="clear" w:fill="EEF2F0"/>
+        </w:rPr>
+        <w:t xml:space="preserve">INSCRIPTION_LIMITE_PAR_HEURE</w:t>
+      </w:r>
+      <w:r>
+        <w:t xml:space="preserve">).</w:t>
       </w:r>
     </w:p>
     <w:p>

</xml_diff>

<commit_message>
Back-office : désactiver un compte interne, remplacer le compte livré
La page Équipe du back-office permet désormais de désactiver ou
réactiver un compte interne (API existante, sessions fermées aussitôt ;
on ne peut pas désactiver le sien). Parcours de mise en service documenté :
créer son propre compte de super-administrateur depuis le compte livré
à l'installation, puis désactiver ce dernier, dont le mot de passe par
défaut est public. Un test de bout en bout couvre ce parcours (96).

Co-Authored-By: Claude Opus 5.5 <noreply@anthropic.com>
Claude-Session: https://claude.ai/code/session_011SyBGTgTJHgxTnZbyUKDiB
</commit_message>
<xml_diff>
--- a/nova-pharma-os/docs/word/GUIDE_DEMARRAGE.docx
+++ b/nova-pharma-os/docs/word/GUIDE_DEMARRAGE.docx
@@ -2068,6 +2068,199 @@
       </w:r>
       <w:r>
         <w:t xml:space="preserve"> du back-office — le menu n'apparaît même pas pour les autres rôles.</w:t>
+      </w:r>
+    </w:p>
+    <w:p>
+      <w:r>
+        <w:rPr>
+          <w:b/>
+        </w:rPr>
+        <w:t xml:space="preserve">Votre propre compte de super-administrateur — à faire dès l'installation.</w:t>
+      </w:r>
+      <w:r>
+        <w:t xml:space="preserve"> Le tout premier super-administrateur n'est créé par personne : l'installation le livre, </w:t>
+      </w:r>
+      <w:r>
+        <w:rPr>
+          <w:rFonts w:ascii="Consolas" w:hAnsi="Consolas"/>
+          <w:sz w:val="19"/>
+          <w:shd w:val="clear" w:fill="EEF2F0"/>
+        </w:rPr>
+        <w:t xml:space="preserve">admin@novapharmaos.com</w:t>
+      </w:r>
+      <w:r>
+        <w:t xml:space="preserve">, avec le mot de passe </w:t>
+      </w:r>
+      <w:r>
+        <w:rPr>
+          <w:rFonts w:ascii="Consolas" w:hAnsi="Consolas"/>
+          <w:sz w:val="19"/>
+          <w:shd w:val="clear" w:fill="EEF2F0"/>
+        </w:rPr>
+        <w:t xml:space="preserve">NovaPharma2026!</w:t>
+      </w:r>
+      <w:r>
+        <w:t xml:space="preserve"> — un mot de passe </w:t>
+      </w:r>
+      <w:r>
+        <w:rPr>
+          <w:b/>
+        </w:rPr>
+        <w:t xml:space="preserve">public</w:t>
+      </w:r>
+      <w:r>
+        <w:t xml:space="preserve">, écrit dans ce guide. Remplacez-le par le vôtre :</w:t>
+      </w:r>
+    </w:p>
+    <w:p>
+      <w:pPr>
+        <w:pStyle w:val="Liste"/>
+        <w:numPr>
+          <w:ilvl w:val="0"/>
+          <w:numId w:val="2"/>
+        </w:numPr>
+      </w:pPr>
+      <w:r>
+        <w:t xml:space="preserve">Connectez-vous au back-office avec </w:t>
+      </w:r>
+      <w:r>
+        <w:rPr>
+          <w:rFonts w:ascii="Consolas" w:hAnsi="Consolas"/>
+          <w:sz w:val="19"/>
+          <w:shd w:val="clear" w:fill="EEF2F0"/>
+        </w:rPr>
+        <w:t xml:space="preserve">admin@novapharmaos.com</w:t>
+      </w:r>
+      <w:r>
+        <w:t xml:space="preserve">.</w:t>
+      </w:r>
+    </w:p>
+    <w:p>
+      <w:pPr>
+        <w:pStyle w:val="Liste"/>
+        <w:numPr>
+          <w:ilvl w:val="0"/>
+          <w:numId w:val="2"/>
+        </w:numPr>
+      </w:pPr>
+      <w:r>
+        <w:t xml:space="preserve">Ouvrez </w:t>
+      </w:r>
+      <w:r>
+        <w:rPr>
+          <w:i/>
+        </w:rPr>
+        <w:t xml:space="preserve">Équipe</w:t>
+      </w:r>
+      <w:r>
+        <w:t xml:space="preserve">, remplissez </w:t>
+      </w:r>
+      <w:r>
+        <w:rPr>
+          <w:i/>
+        </w:rPr>
+        <w:t xml:space="preserve">Créer un compte interne</w:t>
+      </w:r>
+      <w:r>
+        <w:t xml:space="preserve"> avec </w:t>
+      </w:r>
+      <w:r>
+        <w:rPr>
+          <w:b/>
+        </w:rPr>
+        <w:t xml:space="preserve">votre</w:t>
+      </w:r>
+      <w:r>
+        <w:t xml:space="preserve"> nom, téléphone, adresse e-mail et mot de passe, rôle </w:t>
+      </w:r>
+      <w:r>
+        <w:rPr>
+          <w:b/>
+        </w:rPr>
+        <w:t xml:space="preserve">Super administrateur</w:t>
+      </w:r>
+      <w:r>
+        <w:t xml:space="preserve">.</w:t>
+      </w:r>
+    </w:p>
+    <w:p>
+      <w:pPr>
+        <w:pStyle w:val="Liste"/>
+        <w:numPr>
+          <w:ilvl w:val="0"/>
+          <w:numId w:val="2"/>
+        </w:numPr>
+      </w:pPr>
+      <w:r>
+        <w:t xml:space="preserve">Déconnectez-vous, puis reconnectez-vous avec votre nouveau compte.</w:t>
+      </w:r>
+    </w:p>
+    <w:p>
+      <w:pPr>
+        <w:pStyle w:val="Liste"/>
+        <w:numPr>
+          <w:ilvl w:val="0"/>
+          <w:numId w:val="2"/>
+        </w:numPr>
+      </w:pPr>
+      <w:r>
+        <w:t xml:space="preserve">Dans </w:t>
+      </w:r>
+      <w:r>
+        <w:rPr>
+          <w:i/>
+        </w:rPr>
+        <w:t xml:space="preserve">Équipe</w:t>
+      </w:r>
+      <w:r>
+        <w:t xml:space="preserve">, cliquez sur </w:t>
+      </w:r>
+      <w:r>
+        <w:rPr>
+          <w:b/>
+        </w:rPr>
+        <w:t xml:space="preserve">Désactiver</w:t>
+      </w:r>
+      <w:r>
+        <w:t xml:space="preserve"> en face de </w:t>
+      </w:r>
+      <w:r>
+        <w:rPr>
+          <w:rFonts w:ascii="Consolas" w:hAnsi="Consolas"/>
+          <w:sz w:val="19"/>
+          <w:shd w:val="clear" w:fill="EEF2F0"/>
+        </w:rPr>
+        <w:t xml:space="preserve">admin@novapharmaos.com</w:t>
+      </w:r>
+      <w:r>
+        <w:t xml:space="preserve">, puis en face de </w:t>
+      </w:r>
+      <w:r>
+        <w:rPr>
+          <w:rFonts w:ascii="Consolas" w:hAnsi="Consolas"/>
+          <w:sz w:val="19"/>
+          <w:shd w:val="clear" w:fill="EEF2F0"/>
+        </w:rPr>
+        <w:t xml:space="preserve">support@…</w:t>
+      </w:r>
+      <w:r>
+        <w:t xml:space="preserve"> et </w:t>
+      </w:r>
+      <w:r>
+        <w:rPr>
+          <w:rFonts w:ascii="Consolas" w:hAnsi="Consolas"/>
+          <w:sz w:val="19"/>
+          <w:shd w:val="clear" w:fill="EEF2F0"/>
+        </w:rPr>
+        <w:t xml:space="preserve">commercial@…</w:t>
+      </w:r>
+      <w:r>
+        <w:t xml:space="preserve"> (mêmes mots de passe publics). Leurs sessions sont fermées aussitôt.</w:t>
+      </w:r>
+    </w:p>
+    <w:p>
+      <w:r>
+        <w:t xml:space="preserve">Votre propre ligne affiche « vous » au lieu du bouton : on ne peut pas désactiver son propre compte, ce qui évite de s'enfermer dehors.</w:t>
       </w:r>
     </w:p>
     <w:p>

</xml_diff>

<commit_message>
Stock : couleurs d'alerte selon la couverture estimée
Chaque produit reçoit un niveau calculé par l'API (niveau-stock.ts) :
rouge rupture, orange presque épuisé (moins d'une semaine de ventes ou
moitié du seuil), jaune il en reste peu (moins de deux semaines ou seuil
atteint), vert suffisant. La couverture s'estime sur les ventes nettes
des 30 derniers jours ; sans seuil ni vente, repli sur la quantité.

Page Stock : pastille et liseré de couleur, colonne « Couverture
estimée », compteurs cliquables par couleur, produits urgents en tête.
Page Stock du mobile : même pastille. Le filtre onlyIssues suit désormais
ces niveaux. 8 libellés dans les 15 langues, guide mis à jour, 8 tests
(104 au total).

Co-Authored-By: Claude Opus 5.5 <noreply@anthropic.com>
Claude-Session: https://claude.ai/code/session_011SyBGTgTJHgxTnZbyUKDiB
</commit_message>
<xml_diff>
--- a/nova-pharma-os/docs/word/GUIDE_DEMARRAGE.docx
+++ b/nova-pharma-os/docs/word/GUIDE_DEMARRAGE.docx
@@ -1677,6 +1677,360 @@
     <w:p>
       <w:r>
         <w:t xml:space="preserve">À partir de là, l'officine tourne. Le reste — clients à crédit, livraisons, rappels WhatsApp, encaissement Mobile Money — s'ajoute quand vous en avez besoin.</w:t>
+      </w:r>
+    </w:p>
+    <w:p>
+      <w:pPr>
+        <w:pBdr>
+          <w:bottom w:val="single" w:sz="6" w:space="6" w:color="CFE0DA"/>
+        </w:pBdr>
+        <w:spacing w:before="200" w:after="200"/>
+      </w:pPr>
+    </w:p>
+    <w:p>
+      <w:pPr>
+        <w:pStyle w:val="Titre2"/>
+      </w:pPr>
+      <w:r>
+        <w:t xml:space="preserve">Lire les couleurs du stock</w:t>
+      </w:r>
+    </w:p>
+    <w:p>
+      <w:r>
+        <w:t xml:space="preserve">Dans </w:t>
+      </w:r>
+      <w:r>
+        <w:rPr>
+          <w:i/>
+        </w:rPr>
+        <w:t xml:space="preserve">Stock et lots</w:t>
+      </w:r>
+      <w:r>
+        <w:t xml:space="preserve">, chaque produit porte une couleur, et les plus urgents remontent en haut de la liste :</w:t>
+      </w:r>
+    </w:p>
+    <w:tbl>
+      <w:tblPr>
+        <w:tblStyle w:val="Grille"/>
+        <w:tblW w:w="5000" w:type="pct"/>
+        <w:tblBorders>
+          <w:top w:val="single" w:sz="4" w:space="0" w:color="CFE0DA"/>
+          <w:left w:val="single" w:sz="4" w:space="0" w:color="CFE0DA"/>
+          <w:bottom w:val="single" w:sz="4" w:space="0" w:color="CFE0DA"/>
+          <w:right w:val="single" w:sz="4" w:space="0" w:color="CFE0DA"/>
+          <w:insideH w:val="single" w:sz="4" w:space="0" w:color="CFE0DA"/>
+          <w:insideV w:val="single" w:sz="4" w:space="0" w:color="CFE0DA"/>
+        </w:tblBorders>
+        <w:tblCellMar>
+          <w:top w:w="60" w:type="dxa"/>
+          <w:left w:w="90" w:type="dxa"/>
+          <w:bottom w:w="60" w:type="dxa"/>
+          <w:right w:w="90" w:type="dxa"/>
+        </w:tblCellMar>
+      </w:tblPr>
+      <w:tr>
+        <w:trPr>
+          <w:tblHeader/>
+        </w:trPr>
+        <w:tc>
+          <w:tcPr>
+            <w:tcW w:w="3116" w:type="dxa"/>
+            <w:shd w:val="clear" w:fill="E8F2EE"/>
+          </w:tcPr>
+          <w:p>
+            <w:pPr>
+              <w:pStyle w:val="Cellule"/>
+            </w:pPr>
+            <w:r>
+              <w:rPr>
+                <w:b/>
+              </w:rPr>
+              <w:t xml:space="preserve">Couleur</w:t>
+            </w:r>
+          </w:p>
+        </w:tc>
+        <w:tc>
+          <w:tcPr>
+            <w:tcW w:w="3116" w:type="dxa"/>
+            <w:shd w:val="clear" w:fill="E8F2EE"/>
+          </w:tcPr>
+          <w:p>
+            <w:pPr>
+              <w:pStyle w:val="Cellule"/>
+            </w:pPr>
+            <w:r>
+              <w:rPr>
+                <w:b/>
+              </w:rPr>
+              <w:t xml:space="preserve">Signification</w:t>
+            </w:r>
+          </w:p>
+        </w:tc>
+        <w:tc>
+          <w:tcPr>
+            <w:tcW w:w="3116" w:type="dxa"/>
+            <w:shd w:val="clear" w:fill="E8F2EE"/>
+          </w:tcPr>
+          <w:p>
+            <w:pPr>
+              <w:pStyle w:val="Cellule"/>
+            </w:pPr>
+            <w:r>
+              <w:rPr>
+                <w:b/>
+              </w:rPr>
+              <w:t xml:space="preserve">Quand</w:t>
+            </w:r>
+          </w:p>
+        </w:tc>
+      </w:tr>
+      <w:tr>
+        <w:tc>
+          <w:tcPr>
+            <w:tcW w:w="3116" w:type="dxa"/>
+          </w:tcPr>
+          <w:p>
+            <w:pPr>
+              <w:pStyle w:val="Cellule"/>
+            </w:pPr>
+            <w:r>
+              <w:t xml:space="preserve">🔴 </w:t>
+            </w:r>
+            <w:r>
+              <w:rPr>
+                <w:b/>
+              </w:rPr>
+              <w:t xml:space="preserve">Rouge — Rupture</w:t>
+            </w:r>
+          </w:p>
+        </w:tc>
+        <w:tc>
+          <w:tcPr>
+            <w:tcW w:w="3116" w:type="dxa"/>
+          </w:tcPr>
+          <w:p>
+            <w:pPr>
+              <w:pStyle w:val="Cellule"/>
+            </w:pPr>
+            <w:r>
+              <w:t xml:space="preserve">Plus rien en stock</w:t>
+            </w:r>
+          </w:p>
+        </w:tc>
+        <w:tc>
+          <w:tcPr>
+            <w:tcW w:w="3116" w:type="dxa"/>
+          </w:tcPr>
+          <w:p>
+            <w:pPr>
+              <w:pStyle w:val="Cellule"/>
+            </w:pPr>
+            <w:r>
+              <w:t xml:space="preserve">Quantité à zéro</w:t>
+            </w:r>
+          </w:p>
+        </w:tc>
+      </w:tr>
+      <w:tr>
+        <w:tc>
+          <w:tcPr>
+            <w:tcW w:w="3116" w:type="dxa"/>
+          </w:tcPr>
+          <w:p>
+            <w:pPr>
+              <w:pStyle w:val="Cellule"/>
+            </w:pPr>
+            <w:r>
+              <w:t xml:space="preserve">🟠 </w:t>
+            </w:r>
+            <w:r>
+              <w:rPr>
+                <w:b/>
+              </w:rPr>
+              <w:t xml:space="preserve">Orange — Presque épuisé</w:t>
+            </w:r>
+          </w:p>
+        </w:tc>
+        <w:tc>
+          <w:tcPr>
+            <w:tcW w:w="3116" w:type="dxa"/>
+          </w:tcPr>
+          <w:p>
+            <w:pPr>
+              <w:pStyle w:val="Cellule"/>
+            </w:pPr>
+            <w:r>
+              <w:t xml:space="preserve">À commander tout de suite</w:t>
+            </w:r>
+          </w:p>
+        </w:tc>
+        <w:tc>
+          <w:tcPr>
+            <w:tcW w:w="3116" w:type="dxa"/>
+          </w:tcPr>
+          <w:p>
+            <w:pPr>
+              <w:pStyle w:val="Cellule"/>
+            </w:pPr>
+            <w:r>
+              <w:t xml:space="preserve">Moins d'</w:t>
+            </w:r>
+            <w:r>
+              <w:rPr>
+                <w:b/>
+              </w:rPr>
+              <w:t xml:space="preserve">une semaine</w:t>
+            </w:r>
+            <w:r>
+              <w:t xml:space="preserve"> de ventes, ou la moitié du seuil</w:t>
+            </w:r>
+          </w:p>
+        </w:tc>
+      </w:tr>
+      <w:tr>
+        <w:tc>
+          <w:tcPr>
+            <w:tcW w:w="3116" w:type="dxa"/>
+          </w:tcPr>
+          <w:p>
+            <w:pPr>
+              <w:pStyle w:val="Cellule"/>
+            </w:pPr>
+            <w:r>
+              <w:t xml:space="preserve">🟡 </w:t>
+            </w:r>
+            <w:r>
+              <w:rPr>
+                <w:b/>
+              </w:rPr>
+              <w:t xml:space="preserve">Jaune — Il en reste peu</w:t>
+            </w:r>
+          </w:p>
+        </w:tc>
+        <w:tc>
+          <w:tcPr>
+            <w:tcW w:w="3116" w:type="dxa"/>
+          </w:tcPr>
+          <w:p>
+            <w:pPr>
+              <w:pStyle w:val="Cellule"/>
+            </w:pPr>
+            <w:r>
+              <w:t xml:space="preserve">À prévoir dans la prochaine commande</w:t>
+            </w:r>
+          </w:p>
+        </w:tc>
+        <w:tc>
+          <w:tcPr>
+            <w:tcW w:w="3116" w:type="dxa"/>
+          </w:tcPr>
+          <w:p>
+            <w:pPr>
+              <w:pStyle w:val="Cellule"/>
+            </w:pPr>
+            <w:r>
+              <w:t xml:space="preserve">Moins de </w:t>
+            </w:r>
+            <w:r>
+              <w:rPr>
+                <w:b/>
+              </w:rPr>
+              <w:t xml:space="preserve">deux semaines</w:t>
+            </w:r>
+            <w:r>
+              <w:t xml:space="preserve"> de ventes, ou le seuil atteint</w:t>
+            </w:r>
+          </w:p>
+        </w:tc>
+      </w:tr>
+      <w:tr>
+        <w:tc>
+          <w:tcPr>
+            <w:tcW w:w="3116" w:type="dxa"/>
+          </w:tcPr>
+          <w:p>
+            <w:pPr>
+              <w:pStyle w:val="Cellule"/>
+            </w:pPr>
+            <w:r>
+              <w:t xml:space="preserve">🟢 </w:t>
+            </w:r>
+            <w:r>
+              <w:rPr>
+                <w:b/>
+              </w:rPr>
+              <w:t xml:space="preserve">Vert — Suffisant</w:t>
+            </w:r>
+          </w:p>
+        </w:tc>
+        <w:tc>
+          <w:tcPr>
+            <w:tcW w:w="3116" w:type="dxa"/>
+          </w:tcPr>
+          <w:p>
+            <w:pPr>
+              <w:pStyle w:val="Cellule"/>
+            </w:pPr>
+            <w:r>
+              <w:t xml:space="preserve">Rien à faire</w:t>
+            </w:r>
+          </w:p>
+        </w:tc>
+        <w:tc>
+          <w:tcPr>
+            <w:tcW w:w="3116" w:type="dxa"/>
+          </w:tcPr>
+          <w:p>
+            <w:pPr>
+              <w:pStyle w:val="Cellule"/>
+            </w:pPr>
+            <w:r>
+              <w:t xml:space="preserve">Au-delà</w:t>
+            </w:r>
+          </w:p>
+        </w:tc>
+      </w:tr>
+    </w:tbl>
+    <w:p>
+      <w:pPr>
+        <w:spacing w:after="120"/>
+      </w:pPr>
+    </w:p>
+    <w:p>
+      <w:r>
+        <w:t xml:space="preserve">L'application </w:t>
+      </w:r>
+      <w:r>
+        <w:rPr>
+          <w:b/>
+        </w:rPr>
+        <w:t xml:space="preserve">estime</w:t>
+      </w:r>
+      <w:r>
+        <w:t xml:space="preserve"> combien de jours vont durer vos boîtes : elle regarde ce que vous avez vendu ces 30 derniers jours. Si vous vendez 3 boîtes par jour et qu'il en reste 15, cela fait environ 5 jours : orange. La colonne </w:t>
+      </w:r>
+      <w:r>
+        <w:rPr>
+          <w:i/>
+        </w:rPr>
+        <w:t xml:space="preserve">Couverture estimée</w:t>
+      </w:r>
+      <w:r>
+        <w:t xml:space="preserve"> affiche ce nombre de jours.</w:t>
+      </w:r>
+    </w:p>
+    <w:p>
+      <w:r>
+        <w:t xml:space="preserve">Pour un produit qui ne s'est pas encore vendu, elle se fie au </w:t>
+      </w:r>
+      <w:r>
+        <w:rPr>
+          <w:b/>
+        </w:rPr>
+        <w:t xml:space="preserve">seuil</w:t>
+      </w:r>
+      <w:r>
+        <w:t xml:space="preserve"> que vous avez fixé dans le catalogue ; sans seuil non plus, 5 unités ou moins passent en orange et 10 ou moins en jaune. Cliquez sur une couleur, au-dessus du tableau, pour n'afficher que ces produits.</w:t>
       </w:r>
     </w:p>
     <w:p>

</xml_diff>

<commit_message>
Réquisitions en PDF, fournisseurs par produit, comparaison des prix
- Réquisitions : produits, quantités et fournisseur choisi par ligne,
  numérotation RQ-AAAA-NNNNN, statuts (brouillon, envoyée, reçue,
  annulée), PDF par fournisseur avec le logo de la pharmacie,
  partage (WhatsApp, e-mail, partage du fichier) et impression.
- Logo de la pharmacie (PNG/JPEG, 500 Ko) dans les paramètres.
- Fiche produit : ses fournisseurs, leurs prix comparés, ajout d'une
  offre fournisseur, bouton Réquisitionner.
- Stock : dernier fournisseur de chaque produit, fournisseur de chaque
  entrée dans les mouvements.
- Comparaison des prix par produit (productId), moins cher parmi les
  offres disponibles et non périmées, quantité minimum affichée.
- Migration 021, 6 tests e2e (128 au total).

Co-Authored-By: Claude Opus 5.5 <noreply@anthropic.com>
Claude-Session: https://claude.ai/code/session_011SyBGTgTJHgxTnZbyUKDiB
</commit_message>
<xml_diff>
--- a/nova-pharma-os/docs/word/GUIDE_DEMARRAGE.docx
+++ b/nova-pharma-os/docs/word/GUIDE_DEMARRAGE.docx
@@ -2013,6 +2013,278 @@
     <w:p>
       <w:r>
         <w:t xml:space="preserve">Depuis la liste, le numéro de chaque dépôt s'appelle d'un clic, ou ouvre WhatsApp pour lui passer commande.</w:t>
+      </w:r>
+    </w:p>
+    <w:p>
+      <w:pPr>
+        <w:pBdr>
+          <w:bottom w:val="single" w:sz="6" w:space="6" w:color="CFE0DA"/>
+        </w:pBdr>
+        <w:spacing w:before="200" w:after="200"/>
+      </w:pPr>
+    </w:p>
+    <w:p>
+      <w:pPr>
+        <w:pStyle w:val="Titre2"/>
+      </w:pPr>
+      <w:r>
+        <w:t xml:space="preserve">Réquisitionner auprès de vos fournisseurs</w:t>
+      </w:r>
+    </w:p>
+    <w:p>
+      <w:r>
+        <w:t xml:space="preserve">Menu </w:t>
+      </w:r>
+      <w:r>
+        <w:rPr>
+          <w:i/>
+        </w:rPr>
+        <w:t xml:space="preserve">Réquisitions</w:t>
+      </w:r>
+      <w:r>
+        <w:t xml:space="preserve"> (tous les forfaits).</w:t>
+      </w:r>
+    </w:p>
+    <w:p>
+      <w:r>
+        <w:rPr>
+          <w:b/>
+        </w:rPr>
+        <w:t xml:space="preserve">1. Mettez votre logo, une fois pour toutes.</w:t>
+      </w:r>
+      <w:r>
+        <w:t xml:space="preserve"> En bas de la page, </w:t>
+      </w:r>
+      <w:r>
+        <w:rPr>
+          <w:i/>
+        </w:rPr>
+        <w:t xml:space="preserve">Logo de la pharmacie</w:t>
+      </w:r>
+      <w:r>
+        <w:t xml:space="preserve"> : une image PNG ou JPEG de 500 Ko au plus, carrée de préférence. Elle s'imprime en tête de chaque réquisition.</w:t>
+      </w:r>
+    </w:p>
+    <w:p>
+      <w:r>
+        <w:rPr>
+          <w:b/>
+        </w:rPr>
+        <w:t xml:space="preserve">2. Créez la réquisition.</w:t>
+      </w:r>
+      <w:r>
+        <w:t xml:space="preserve"> </w:t>
+      </w:r>
+      <w:r>
+        <w:rPr>
+          <w:i/>
+        </w:rPr>
+        <w:t xml:space="preserve">Nouvelle réquisition</w:t>
+      </w:r>
+      <w:r>
+        <w:t xml:space="preserve"> : pour chaque produit, tapez son nom et la quantité voulue. Les offres de vos fournisseurs s'affichent aussitôt sous la ligne, </w:t>
+      </w:r>
+      <w:r>
+        <w:rPr>
+          <w:b/>
+        </w:rPr>
+        <w:t xml:space="preserve">la moins chère d'abord</w:t>
+      </w:r>
+      <w:r>
+        <w:t xml:space="preserve"> — parmi celles qui sont disponibles et non périmées — avec la quantité minimum et la date d'expiration. L'application retient d'office la moins chère ; cliquez sur une autre offre pour la préférer. Si vous demandez moins que le minimum du fournisseur, elle vous le signale. Un produit sans offre peut attendre : « à choisir plus tard ».</w:t>
+      </w:r>
+    </w:p>
+    <w:p>
+      <w:r>
+        <w:rPr>
+          <w:b/>
+        </w:rPr>
+        <w:t xml:space="preserve">3. Envoyez-la.</w:t>
+      </w:r>
+      <w:r>
+        <w:t xml:space="preserve"> La page de la réquisition présente une section par fournisseur, avec son total estimé et quatre boutons :</w:t>
+      </w:r>
+    </w:p>
+    <w:p>
+      <w:pPr>
+        <w:pStyle w:val="Liste"/>
+        <w:numPr>
+          <w:ilvl w:val="0"/>
+          <w:numId w:val="1"/>
+        </w:numPr>
+      </w:pPr>
+      <w:r>
+        <w:rPr>
+          <w:b/>
+        </w:rPr>
+        <w:t xml:space="preserve">Ouvrir le PDF / imprimer</w:t>
+      </w:r>
+      <w:r>
+        <w:t xml:space="preserve"> : le bon au logo de la pharmacie, avec les coordonnées du fournisseur, les quantités, les prix de son catalogue et une place pour la signature et le cachet ;</w:t>
+      </w:r>
+    </w:p>
+    <w:p>
+      <w:pPr>
+        <w:pStyle w:val="Liste"/>
+        <w:numPr>
+          <w:ilvl w:val="0"/>
+          <w:numId w:val="1"/>
+        </w:numPr>
+      </w:pPr>
+      <w:r>
+        <w:rPr>
+          <w:b/>
+        </w:rPr>
+        <w:t xml:space="preserve">Partager le PDF</w:t>
+      </w:r>
+      <w:r>
+        <w:t xml:space="preserve"> : depuis un téléphone, l'envoie directement par WhatsApp, e-mail ou toute autre application ; depuis un ordinateur, l'enregistre pour le joindre à votre message ;</w:t>
+      </w:r>
+    </w:p>
+    <w:p>
+      <w:pPr>
+        <w:pStyle w:val="Liste"/>
+        <w:numPr>
+          <w:ilvl w:val="0"/>
+          <w:numId w:val="1"/>
+        </w:numPr>
+      </w:pPr>
+      <w:r>
+        <w:rPr>
+          <w:b/>
+        </w:rPr>
+        <w:t xml:space="preserve">WhatsApp</w:t>
+      </w:r>
+      <w:r>
+        <w:t xml:space="preserve"> et </w:t>
+      </w:r>
+      <w:r>
+        <w:rPr>
+          <w:b/>
+        </w:rPr>
+        <w:t xml:space="preserve">E-mail</w:t>
+      </w:r>
+      <w:r>
+        <w:t xml:space="preserve"> : ouvrent un message au fournisseur, la liste des produits déjà écrite.</w:t>
+      </w:r>
+    </w:p>
+    <w:p>
+      <w:r>
+        <w:rPr>
+          <w:i/>
+        </w:rPr>
+        <w:t xml:space="preserve">Document complet</w:t>
+      </w:r>
+      <w:r>
+        <w:t xml:space="preserve"> réunit tous les fournisseurs, un par page. Marquez ensuite la réquisition </w:t>
+      </w:r>
+      <w:r>
+        <w:rPr>
+          <w:b/>
+        </w:rPr>
+        <w:t xml:space="preserve">envoyée</w:t>
+      </w:r>
+      <w:r>
+        <w:t xml:space="preserve">, puis </w:t>
+      </w:r>
+      <w:r>
+        <w:rPr>
+          <w:b/>
+        </w:rPr>
+        <w:t xml:space="preserve">reçue</w:t>
+      </w:r>
+      <w:r>
+        <w:t xml:space="preserve"> ; à la livraison, enregistrez l'achat dans </w:t>
+      </w:r>
+      <w:r>
+        <w:rPr>
+          <w:i/>
+        </w:rPr>
+        <w:t xml:space="preserve">Stock et lots</w:t>
+      </w:r>
+      <w:r>
+        <w:t xml:space="preserve"> comme d'habitude.</w:t>
+      </w:r>
+    </w:p>
+    <w:p>
+      <w:pPr>
+        <w:pStyle w:val="Titre2"/>
+      </w:pPr>
+      <w:r>
+        <w:t xml:space="preserve">Les fournisseurs de chaque médicament</w:t>
+      </w:r>
+    </w:p>
+    <w:p>
+      <w:r>
+        <w:t xml:space="preserve">Sur la fiche d'un produit (cliquez sur son nom dans </w:t>
+      </w:r>
+      <w:r>
+        <w:rPr>
+          <w:i/>
+        </w:rPr>
+        <w:t xml:space="preserve">Stock et lots</w:t>
+      </w:r>
+      <w:r>
+        <w:t xml:space="preserve"> ou </w:t>
+      </w:r>
+      <w:r>
+        <w:rPr>
+          <w:i/>
+        </w:rPr>
+        <w:t xml:space="preserve">Catalogue</w:t>
+      </w:r>
+      <w:r>
+        <w:t xml:space="preserve">), la section </w:t>
+      </w:r>
+      <w:r>
+        <w:rPr>
+          <w:b/>
+        </w:rPr>
+        <w:t xml:space="preserve">Fournisseurs de ce produit</w:t>
+      </w:r>
+      <w:r>
+        <w:t xml:space="preserve"> compare les prix de tous les dépôts qui le proposent, avec minimum, fabrication, expiration et disponibilité ; le moins cher disponible et non périmé est surligné. Le formulaire en dessous ajoute un fournisseur pour ce produit, ou met à jour son prix. Le bouton </w:t>
+      </w:r>
+      <w:r>
+        <w:rPr>
+          <w:b/>
+        </w:rPr>
+        <w:t xml:space="preserve">Réquisitionner</w:t>
+      </w:r>
+      <w:r>
+        <w:t xml:space="preserve"> ouvre une réquisition avec ce produit.</w:t>
+      </w:r>
+    </w:p>
+    <w:p>
+      <w:r>
+        <w:t xml:space="preserve">Chaque achat mis en stock garde son fournisseur : la colonne </w:t>
+      </w:r>
+      <w:r>
+        <w:rPr>
+          <w:i/>
+        </w:rPr>
+        <w:t xml:space="preserve">Dernier fournisseur</w:t>
+      </w:r>
+      <w:r>
+        <w:t xml:space="preserve"> de </w:t>
+      </w:r>
+      <w:r>
+        <w:rPr>
+          <w:i/>
+        </w:rPr>
+        <w:t xml:space="preserve">Stock et lots</w:t>
+      </w:r>
+      <w:r>
+        <w:t xml:space="preserve"> et la colonne </w:t>
+      </w:r>
+      <w:r>
+        <w:rPr>
+          <w:i/>
+        </w:rPr>
+        <w:t xml:space="preserve">Fournisseur</w:t>
+      </w:r>
+      <w:r>
+        <w:t xml:space="preserve"> des mouvements de la fiche le montrent.</w:t>
       </w:r>
     </w:p>
     <w:p>

</xml_diff>

<commit_message>
Factures clients en PDF et catalogue de référence Goma–Bukavu
- Factures : établir la facture d'une vente (à la caisse ou plus tard),
  au nom d'un client du fichier ou nommé sur le moment (retrouvé par
  son téléphone, sinon créé), PDF au logo de la pharmacie avec lots,
  péremptions, règlement, monnaie rendue et reste dû ; impression,
  partage, WhatsApp, e-mail. Pages Factures, facture, vente ; lien
  Factures par client. Une vente à crédit reste due sur sa facture.
- Catalogue de référence : 100 médicaments et produits courants au
  Kivu, importables en un clic avec prix indicatifs (USD) modifiables ;
  prix de la pharmacie exigés hors USD ; aucun doublon.
- Mise en page PDF commune aux réquisitions et aux factures.
- Le dosage n'est plus répété quand il figure déjà dans le nom.
- 5 tests e2e (133 au total).

Co-Authored-By: Claude Opus 5.5 <noreply@anthropic.com>
Claude-Session: https://claude.ai/code/session_011SyBGTgTJHgxTnZbyUKDiB
</commit_message>
<xml_diff>
--- a/nova-pharma-os/docs/word/GUIDE_DEMARRAGE.docx
+++ b/nova-pharma-os/docs/word/GUIDE_DEMARRAGE.docx
@@ -1595,54 +1595,330 @@
         <w:t xml:space="preserve">1. Complétez le catalogue.</w:t>
       </w:r>
       <w:r>
+        <w:t xml:space="preserve"> Le plus rapide : </w:t>
+      </w:r>
+      <w:r>
+        <w:rPr>
+          <w:i/>
+        </w:rPr>
+        <w:t xml:space="preserve">Catalogue</w:t>
+      </w:r>
+      <w:r>
+        <w:t xml:space="preserve"> → </w:t>
+      </w:r>
+      <w:r>
+        <w:rPr>
+          <w:b/>
+        </w:rPr>
+        <w:t xml:space="preserve">Catalogue de référence Goma–Bukavu</w:t>
+      </w:r>
+      <w:r>
+        <w:t xml:space="preserve"> → </w:t>
+      </w:r>
+      <w:r>
+        <w:rPr>
+          <w:i/>
+        </w:rPr>
+        <w:t xml:space="preserve">Choisir et ajouter</w:t>
+      </w:r>
+      <w:r>
+        <w:t xml:space="preserve">. Cent médicaments et produits courants au Kivu (voir plus bas) s'ajoutent en un clic. Pour un produit absent de cette liste, ouvrez </w:t>
+      </w:r>
+      <w:r>
+        <w:rPr>
+          <w:i/>
+        </w:rPr>
+        <w:t xml:space="preserve">Catalogue</w:t>
+      </w:r>
+      <w:r>
+        <w:t xml:space="preserve">, puis </w:t>
+      </w:r>
+      <w:r>
+        <w:rPr>
+          <w:b/>
+        </w:rPr>
+        <w:t xml:space="preserve">Ajouter un produit ou un médicament</w:t>
+      </w:r>
+      <w:r>
+        <w:t xml:space="preserve"> : le nom, le dosage, la forme, le conditionnement, le prix de vente et le prix d'achat habituel. La référence est tirée du nom si vous la laissez vide. Cochez </w:t>
+      </w:r>
+      <w:r>
+        <w:rPr>
+          <w:i/>
+        </w:rPr>
+        <w:t xml:space="preserve">Périssable</w:t>
+      </w:r>
+      <w:r>
+        <w:t xml:space="preserve"> pour tout ce qui a une date de péremption, et </w:t>
+      </w:r>
+      <w:r>
+        <w:rPr>
+          <w:i/>
+        </w:rPr>
+        <w:t xml:space="preserve">Délivré sur ordonnance</w:t>
+      </w:r>
+      <w:r>
+        <w:t xml:space="preserve"> quand c'est le cas. (La modification et la suppression d'un produit depuis cet écran ne sont pas encore disponibles.)</w:t>
+      </w:r>
+    </w:p>
+    <w:p>
+      <w:r>
+        <w:rPr>
+          <w:b/>
+        </w:rPr>
+        <w:t xml:space="preserve">2. Enregistrez un achat.</w:t>
+      </w:r>
+      <w:r>
         <w:t xml:space="preserve"> Ouvrez </w:t>
       </w:r>
       <w:r>
         <w:rPr>
           <w:i/>
         </w:rPr>
+        <w:t xml:space="preserve">Stock et lots</w:t>
+      </w:r>
+      <w:r>
+        <w:t xml:space="preserve">, puis </w:t>
+      </w:r>
+      <w:r>
+        <w:rPr>
+          <w:b/>
+        </w:rPr>
+        <w:t xml:space="preserve">Enregistrer un achat (entrée en stock)</w:t>
+      </w:r>
+      <w:r>
+        <w:t xml:space="preserve">. Prenez une facture réelle et saisissez-la ligne par ligne : chaque produit, la </w:t>
+      </w:r>
+      <w:r>
+        <w:rPr>
+          <w:b/>
+        </w:rPr>
+        <w:t xml:space="preserve">quantité achetée</w:t>
+      </w:r>
+      <w:r>
+        <w:t xml:space="preserve">, le prix d'achat, le </w:t>
+      </w:r>
+      <w:r>
+        <w:rPr>
+          <w:b/>
+        </w:rPr>
+        <w:t xml:space="preserve">numéro de lot</w:t>
+      </w:r>
+      <w:r>
+        <w:t xml:space="preserve"> et la </w:t>
+      </w:r>
+      <w:r>
+        <w:rPr>
+          <w:b/>
+        </w:rPr>
+        <w:t xml:space="preserve">date de péremption</w:t>
+      </w:r>
+      <w:r>
+        <w:t xml:space="preserve">. </w:t>
+      </w:r>
+      <w:r>
+        <w:rPr>
+          <w:i/>
+        </w:rPr>
+        <w:t xml:space="preserve">Ajouter un produit à cet achat</w:t>
+      </w:r>
+      <w:r>
+        <w:t xml:space="preserve"> ajoute une ligne ; le total s'affiche en bas. Le fournisseur est facultatif : sans lui, l'achat est rangé dans « achats divers ». C'est ce geste qui crée le stock, dans tous les forfaits. L'application refuse un produit périssable sans date de péremption, et un double clic n'enregistre jamais l'achat deux fois.</w:t>
+      </w:r>
+    </w:p>
+    <w:p>
+      <w:r>
+        <w:rPr>
+          <w:b/>
+        </w:rPr>
+        <w:t xml:space="preserve">3. Faites une vente.</w:t>
+      </w:r>
+      <w:r>
+        <w:t xml:space="preserve"> Ouvrez </w:t>
+      </w:r>
+      <w:r>
+        <w:rPr>
+          <w:i/>
+        </w:rPr>
+        <w:t xml:space="preserve">Caisse</w:t>
+      </w:r>
+      <w:r>
+        <w:t xml:space="preserve">. Le stock que vous venez de recevoir apparaît. À la sortie, l'application prend d'elle-même le lot qui périme le plus tôt : vous n'avez rien à surveiller.</w:t>
+      </w:r>
+    </w:p>
+    <w:p>
+      <w:r>
+        <w:rPr>
+          <w:b/>
+        </w:rPr>
+        <w:t xml:space="preserve">4. Suivez ce qui entre et ce qui sort.</w:t>
+      </w:r>
+      <w:r>
+        <w:t xml:space="preserve"> Dans </w:t>
+      </w:r>
+      <w:r>
+        <w:rPr>
+          <w:i/>
+        </w:rPr>
+        <w:t xml:space="preserve">Stock et lots</w:t>
+      </w:r>
+      <w:r>
+        <w:t xml:space="preserve">, les colonnes </w:t>
+      </w:r>
+      <w:r>
+        <w:rPr>
+          <w:i/>
+        </w:rPr>
+        <w:t xml:space="preserve">Acheté (30 j)</w:t>
+      </w:r>
+      <w:r>
+        <w:t xml:space="preserve"> et </w:t>
+      </w:r>
+      <w:r>
+        <w:rPr>
+          <w:i/>
+        </w:rPr>
+        <w:t xml:space="preserve">Vendu (30 j)</w:t>
+      </w:r>
+      <w:r>
+        <w:t xml:space="preserve"> donnent les quantités du mois. Cliquez sur le nom d'un produit : sa fiche montre le total acheté, le total vendu, les autres mouvements (casse, périmés, inventaire) et chaque mouvement, avec la date, le lot et la personne. Le stock affiché est exactement la somme de ces lignes.</w:t>
+      </w:r>
+    </w:p>
+    <w:p>
+      <w:r>
+        <w:t xml:space="preserve">À partir de là, l'officine tourne. Le reste — clients à crédit, livraisons, rappels WhatsApp, encaissement Mobile Money — s'ajoute quand vous en avez besoin.</w:t>
+      </w:r>
+    </w:p>
+    <w:p>
+      <w:pPr>
+        <w:pBdr>
+          <w:bottom w:val="single" w:sz="6" w:space="6" w:color="CFE0DA"/>
+        </w:pBdr>
+        <w:spacing w:before="200" w:after="200"/>
+      </w:pPr>
+    </w:p>
+    <w:p>
+      <w:pPr>
+        <w:pStyle w:val="Titre2"/>
+      </w:pPr>
+      <w:r>
+        <w:t xml:space="preserve">Le catalogue de référence Goma–Bukavu</w:t>
+      </w:r>
+    </w:p>
+    <w:p>
+      <w:r>
+        <w:t xml:space="preserve">Menu </w:t>
+      </w:r>
+      <w:r>
+        <w:rPr>
+          <w:i/>
+        </w:rPr>
         <w:t xml:space="preserve">Catalogue</w:t>
       </w:r>
       <w:r>
-        <w:t xml:space="preserve">, puis </w:t>
-      </w:r>
-      <w:r>
-        <w:rPr>
-          <w:b/>
-        </w:rPr>
-        <w:t xml:space="preserve">Ajouter un produit ou un médicament</w:t>
-      </w:r>
-      <w:r>
-        <w:t xml:space="preserve"> : le nom, le dosage, la forme, le conditionnement, le prix de vente et le prix d'achat habituel. La référence est tirée du nom si vous la laissez vide. Cochez </w:t>
-      </w:r>
-      <w:r>
-        <w:rPr>
-          <w:i/>
-        </w:rPr>
-        <w:t xml:space="preserve">Périssable</w:t>
-      </w:r>
-      <w:r>
-        <w:t xml:space="preserve"> pour tout ce qui a une date de péremption, et </w:t>
-      </w:r>
-      <w:r>
-        <w:rPr>
-          <w:i/>
-        </w:rPr>
-        <w:t xml:space="preserve">Délivré sur ordonnance</w:t>
-      </w:r>
-      <w:r>
-        <w:t xml:space="preserve"> quand c'est le cas. (La modification et la suppression d'un produit depuis cet écran ne sont pas encore disponibles.)</w:t>
-      </w:r>
-    </w:p>
-    <w:p>
-      <w:r>
-        <w:rPr>
-          <w:b/>
-        </w:rPr>
-        <w:t xml:space="preserve">2. Enregistrez un achat.</w:t>
-      </w:r>
-      <w:r>
-        <w:t xml:space="preserve"> Ouvrez </w:t>
+        <w:t xml:space="preserve"> → </w:t>
+      </w:r>
+      <w:r>
+        <w:rPr>
+          <w:b/>
+        </w:rPr>
+        <w:t xml:space="preserve">Catalogue de référence Goma–Bukavu</w:t>
+      </w:r>
+      <w:r>
+        <w:t xml:space="preserve"> (tous les forfaits).</w:t>
+      </w:r>
+    </w:p>
+    <w:p>
+      <w:r>
+        <w:t xml:space="preserve">Cent médicaments et produits que l'on retrouve dans presque toutes les officines du Nord et du Sud-Kivu, rangés en seize familles : antipaludiques (artéméther-luméfantrine adulte et enfant, ASAQ, artésunate injectable, quinine…), antibiotiques, douleur et fièvre, vermifuges, SRO et zinc, estomac, toux et allergie, vitamines et fer, tension, diabète, peau, yeux, santé de la femme et planning familial, solutés, consommables de soins et tests rapides du paludisme.</w:t>
+      </w:r>
+    </w:p>
+    <w:p>
+      <w:r>
+        <w:t xml:space="preserve">La sélection s'appuie sur la Liste nationale des médicaments essentiels de la RD Congo et sur les demandes les plus fréquentes au comptoir. Chaque produit arrive complet : nom, DCI, forme, conditionnement, unité de vente (plaquette, flacon, ampoule…), famille, et les repères </w:t>
+      </w:r>
+      <w:r>
+        <w:rPr>
+          <w:i/>
+        </w:rPr>
+        <w:t xml:space="preserve">sur ordonnance</w:t>
+      </w:r>
+      <w:r>
+        <w:t xml:space="preserve">, </w:t>
+      </w:r>
+      <w:r>
+        <w:rPr>
+          <w:i/>
+        </w:rPr>
+        <w:t xml:space="preserve">stupéfiant</w:t>
+      </w:r>
+      <w:r>
+        <w:t xml:space="preserve"> ou </w:t>
+      </w:r>
+      <w:r>
+        <w:rPr>
+          <w:i/>
+        </w:rPr>
+        <w:t xml:space="preserve">chaîne du froid</w:t>
+      </w:r>
+      <w:r>
+        <w:t xml:space="preserve">.</w:t>
+      </w:r>
+    </w:p>
+    <w:p>
+      <w:r>
+        <w:rPr>
+          <w:b/>
+        </w:rPr>
+        <w:t xml:space="preserve">1.</w:t>
+      </w:r>
+      <w:r>
+        <w:t xml:space="preserve"> Tout est coché d'office. Filtrez par famille et décochez ce que vous ne vendez pas.</w:t>
+      </w:r>
+    </w:p>
+    <w:p>
+      <w:r>
+        <w:rPr>
+          <w:b/>
+        </w:rPr>
+        <w:t xml:space="preserve">2.</w:t>
+      </w:r>
+      <w:r>
+        <w:t xml:space="preserve"> Vérifiez les prix. Ceux proposés sont </w:t>
+      </w:r>
+      <w:r>
+        <w:rPr>
+          <w:b/>
+        </w:rPr>
+        <w:t xml:space="preserve">indicatifs, en dollars</w:t>
+      </w:r>
+      <w:r>
+        <w:t xml:space="preserve"> : un ordre de grandeur de la région, à remplacer par les vôtres. Si votre pharmacie compte en francs congolais, les prix indicatifs ne sont pas repris : saisissez votre prix de vente pour chaque produit coché.</w:t>
+      </w:r>
+    </w:p>
+    <w:p>
+      <w:r>
+        <w:rPr>
+          <w:b/>
+        </w:rPr>
+        <w:t xml:space="preserve">3.</w:t>
+      </w:r>
+      <w:r>
+        <w:t xml:space="preserve"> </w:t>
+      </w:r>
+      <w:r>
+        <w:rPr>
+          <w:i/>
+        </w:rPr>
+        <w:t xml:space="preserve">Ajouter … produit(s) à mon catalogue</w:t>
+      </w:r>
+      <w:r>
+        <w:t xml:space="preserve">. Un produit déjà présent (même référence ou même nom) n'est jamais créé deux fois.</w:t>
+      </w:r>
+    </w:p>
+    <w:p>
+      <w:r>
+        <w:t xml:space="preserve">Il reste ensuite à enregistrer leur stock, comme pour tout produit (</w:t>
       </w:r>
       <w:r>
         <w:rPr>
@@ -1651,115 +1927,282 @@
         <w:t xml:space="preserve">Stock et lots</w:t>
       </w:r>
       <w:r>
-        <w:t xml:space="preserve">, puis </w:t>
-      </w:r>
-      <w:r>
-        <w:rPr>
-          <w:b/>
-        </w:rPr>
-        <w:t xml:space="preserve">Enregistrer un achat (entrée en stock)</w:t>
-      </w:r>
-      <w:r>
-        <w:t xml:space="preserve">. Prenez une facture réelle et saisissez-la ligne par ligne : chaque produit, la </w:t>
-      </w:r>
-      <w:r>
-        <w:rPr>
-          <w:b/>
-        </w:rPr>
-        <w:t xml:space="preserve">quantité achetée</w:t>
-      </w:r>
-      <w:r>
-        <w:t xml:space="preserve">, le prix d'achat, le </w:t>
-      </w:r>
-      <w:r>
-        <w:rPr>
-          <w:b/>
-        </w:rPr>
-        <w:t xml:space="preserve">numéro de lot</w:t>
-      </w:r>
-      <w:r>
-        <w:t xml:space="preserve"> et la </w:t>
-      </w:r>
-      <w:r>
-        <w:rPr>
-          <w:b/>
-        </w:rPr>
-        <w:t xml:space="preserve">date de péremption</w:t>
-      </w:r>
-      <w:r>
-        <w:t xml:space="preserve">. </w:t>
-      </w:r>
-      <w:r>
-        <w:rPr>
-          <w:i/>
-        </w:rPr>
-        <w:t xml:space="preserve">Ajouter un produit à cet achat</w:t>
-      </w:r>
-      <w:r>
-        <w:t xml:space="preserve"> ajoute une ligne ; le total s'affiche en bas. Le fournisseur est facultatif : sans lui, l'achat est rangé dans « achats divers ». C'est ce geste qui crée le stock, dans tous les forfaits. L'application refuse un produit périssable sans date de péremption, et un double clic n'enregistre jamais l'achat deux fois.</w:t>
-      </w:r>
-    </w:p>
-    <w:p>
-      <w:r>
-        <w:rPr>
-          <w:b/>
-        </w:rPr>
-        <w:t xml:space="preserve">3. Faites une vente.</w:t>
-      </w:r>
-      <w:r>
-        <w:t xml:space="preserve"> Ouvrez </w:t>
-      </w:r>
-      <w:r>
-        <w:rPr>
-          <w:i/>
-        </w:rPr>
-        <w:t xml:space="preserve">Caisse</w:t>
-      </w:r>
-      <w:r>
-        <w:t xml:space="preserve">. Le stock que vous venez de recevoir apparaît. À la sortie, l'application prend d'elle-même le lot qui périme le plus tôt : vous n'avez rien à surveiller.</w:t>
-      </w:r>
-    </w:p>
-    <w:p>
-      <w:r>
-        <w:rPr>
-          <w:b/>
-        </w:rPr>
-        <w:t xml:space="preserve">4. Suivez ce qui entre et ce qui sort.</w:t>
-      </w:r>
-      <w:r>
-        <w:t xml:space="preserve"> Dans </w:t>
-      </w:r>
-      <w:r>
-        <w:rPr>
-          <w:i/>
-        </w:rPr>
-        <w:t xml:space="preserve">Stock et lots</w:t>
-      </w:r>
-      <w:r>
-        <w:t xml:space="preserve">, les colonnes </w:t>
-      </w:r>
-      <w:r>
-        <w:rPr>
-          <w:i/>
-        </w:rPr>
-        <w:t xml:space="preserve">Acheté (30 j)</w:t>
+        <w:t xml:space="preserve"> → </w:t>
+      </w:r>
+      <w:r>
+        <w:rPr>
+          <w:i/>
+        </w:rPr>
+        <w:t xml:space="preserve">Enregistrer un achat</w:t>
+      </w:r>
+      <w:r>
+        <w:t xml:space="preserve">).</w:t>
+      </w:r>
+    </w:p>
+    <w:p>
+      <w:pPr>
+        <w:pStyle w:val="Titre2"/>
+      </w:pPr>
+      <w:r>
+        <w:t xml:space="preserve">Établir, imprimer et partager la facture d'un client</w:t>
+      </w:r>
+    </w:p>
+    <w:p>
+      <w:r>
+        <w:t xml:space="preserve">Menu </w:t>
+      </w:r>
+      <w:r>
+        <w:rPr>
+          <w:i/>
+        </w:rPr>
+        <w:t xml:space="preserve">Factures</w:t>
+      </w:r>
+      <w:r>
+        <w:t xml:space="preserve"> (tous les forfaits). Une vente a toujours son reçu. La </w:t>
+      </w:r>
+      <w:r>
+        <w:rPr>
+          <w:b/>
+        </w:rPr>
+        <w:t xml:space="preserve">facture</w:t>
+      </w:r>
+      <w:r>
+        <w:t xml:space="preserve"> se fait à la demande du client : pour son assurance, son employeur, ou simplement pour la garder.</w:t>
+      </w:r>
+    </w:p>
+    <w:p>
+      <w:r>
+        <w:rPr>
+          <w:b/>
+        </w:rPr>
+        <w:t xml:space="preserve">À la caisse, juste après la vente.</w:t>
+      </w:r>
+      <w:r>
+        <w:t xml:space="preserve"> Sous le message « Vente … enregistrée », ouvrez </w:t>
+      </w:r>
+      <w:r>
+        <w:rPr>
+          <w:b/>
+        </w:rPr>
+        <w:t xml:space="preserve">Établir la facture de la vente</w:t>
+      </w:r>
+      <w:r>
+        <w:t xml:space="preserve">. Tapez le nom et le téléphone du client :</w:t>
+      </w:r>
+    </w:p>
+    <w:p>
+      <w:pPr>
+        <w:pStyle w:val="Liste"/>
+        <w:numPr>
+          <w:ilvl w:val="0"/>
+          <w:numId w:val="1"/>
+        </w:numPr>
+      </w:pPr>
+      <w:r>
+        <w:t xml:space="preserve">s'il est </w:t>
+      </w:r>
+      <w:r>
+        <w:rPr>
+          <w:b/>
+        </w:rPr>
+        <w:t xml:space="preserve">déjà dans votre fichier</w:t>
+      </w:r>
+      <w:r>
+        <w:t xml:space="preserve">, il vous est proposé dès les premières lettres ou chiffres : cliquez dessus ;</w:t>
+      </w:r>
+    </w:p>
+    <w:p>
+      <w:pPr>
+        <w:pStyle w:val="Liste"/>
+        <w:numPr>
+          <w:ilvl w:val="0"/>
+          <w:numId w:val="1"/>
+        </w:numPr>
+      </w:pPr>
+      <w:r>
+        <w:t xml:space="preserve">sinon, il y est </w:t>
+      </w:r>
+      <w:r>
+        <w:rPr>
+          <w:b/>
+        </w:rPr>
+        <w:t xml:space="preserve">ajouté</w:t>
+      </w:r>
+      <w:r>
+        <w:t xml:space="preserve"> automatiquement. S'il revient avec son numéro écrit autrement (« 0991 234 567 » ou « +243 991-234-567 »), il est reconnu ;</w:t>
+      </w:r>
+    </w:p>
+    <w:p>
+      <w:pPr>
+        <w:pStyle w:val="Liste"/>
+        <w:numPr>
+          <w:ilvl w:val="0"/>
+          <w:numId w:val="1"/>
+        </w:numPr>
+      </w:pPr>
+      <w:r>
+        <w:t xml:space="preserve">sans nom, la facture est établie pour un </w:t>
+      </w:r>
+      <w:r>
+        <w:rPr>
+          <w:b/>
+        </w:rPr>
+        <w:t xml:space="preserve">client comptant</w:t>
+      </w:r>
+      <w:r>
+        <w:t xml:space="preserve">.</w:t>
+      </w:r>
+    </w:p>
+    <w:p>
+      <w:r>
+        <w:rPr>
+          <w:b/>
+        </w:rPr>
+        <w:t xml:space="preserve">Plus tard.</w:t>
+      </w:r>
+      <w:r>
+        <w:t xml:space="preserve"> Menu </w:t>
+      </w:r>
+      <w:r>
+        <w:rPr>
+          <w:i/>
+        </w:rPr>
+        <w:t xml:space="preserve">Factures</w:t>
+      </w:r>
+      <w:r>
+        <w:t xml:space="preserve"> → </w:t>
+      </w:r>
+      <w:r>
+        <w:rPr>
+          <w:i/>
+        </w:rPr>
+        <w:t xml:space="preserve">Ventes récentes</w:t>
+      </w:r>
+      <w:r>
+        <w:t xml:space="preserve"> → </w:t>
+      </w:r>
+      <w:r>
+        <w:rPr>
+          <w:b/>
+        </w:rPr>
+        <w:t xml:space="preserve">Établir la facture</w:t>
+      </w:r>
+      <w:r>
+        <w:t xml:space="preserve"> sur la bonne vente.</w:t>
+      </w:r>
+    </w:p>
+    <w:p>
+      <w:r>
+        <w:t xml:space="preserve">La facture reçoit son numéro (FA-2026-000001…). Elle s'ouvre avec les mêmes boutons que les réquisitions :</w:t>
+      </w:r>
+    </w:p>
+    <w:p>
+      <w:pPr>
+        <w:pStyle w:val="Liste"/>
+        <w:numPr>
+          <w:ilvl w:val="0"/>
+          <w:numId w:val="1"/>
+        </w:numPr>
+      </w:pPr>
+      <w:r>
+        <w:rPr>
+          <w:b/>
+        </w:rPr>
+        <w:t xml:space="preserve">Ouvrir le PDF / imprimer</w:t>
+      </w:r>
+      <w:r>
+        <w:t xml:space="preserve"> : la facture au logo de la pharmacie, avec le client, chaque article avec son lot et sa date d'expiration, le total TTC, le règlement, la monnaie rendue et le reste à payer. Un tampon indique « PAYÉE » ou « ANNULÉE ». Le bas de page porte « Servi par » et une place pour le cachet ;</w:t>
+      </w:r>
+    </w:p>
+    <w:p>
+      <w:pPr>
+        <w:pStyle w:val="Liste"/>
+        <w:numPr>
+          <w:ilvl w:val="0"/>
+          <w:numId w:val="1"/>
+        </w:numPr>
+      </w:pPr>
+      <w:r>
+        <w:rPr>
+          <w:b/>
+        </w:rPr>
+        <w:t xml:space="preserve">Partager le PDF</w:t>
+      </w:r>
+      <w:r>
+        <w:t xml:space="preserve"> : depuis le téléphone, directement par WhatsApp, e-mail…</w:t>
+      </w:r>
+    </w:p>
+    <w:p>
+      <w:pPr>
+        <w:pStyle w:val="Liste"/>
+        <w:numPr>
+          <w:ilvl w:val="0"/>
+          <w:numId w:val="1"/>
+        </w:numPr>
+      </w:pPr>
+      <w:r>
+        <w:rPr>
+          <w:b/>
+        </w:rPr>
+        <w:t xml:space="preserve">WhatsApp</w:t>
       </w:r>
       <w:r>
         <w:t xml:space="preserve"> et </w:t>
       </w:r>
       <w:r>
         <w:rPr>
-          <w:i/>
-        </w:rPr>
-        <w:t xml:space="preserve">Vendu (30 j)</w:t>
-      </w:r>
-      <w:r>
-        <w:t xml:space="preserve"> donnent les quantités du mois. Cliquez sur le nom d'un produit : sa fiche montre le total acheté, le total vendu, les autres mouvements (casse, périmés, inventaire) et chaque mouvement, avec la date, le lot et la personne. Le stock affiché est exactement la somme de ces lignes.</w:t>
-      </w:r>
-    </w:p>
-    <w:p>
-      <w:r>
-        <w:t xml:space="preserve">À partir de là, l'officine tourne. Le reste — clients à crédit, livraisons, rappels WhatsApp, encaissement Mobile Money — s'ajoute quand vous en avez besoin.</w:t>
+          <w:b/>
+        </w:rPr>
+        <w:t xml:space="preserve">E-mail</w:t>
+      </w:r>
+      <w:r>
+        <w:t xml:space="preserve"> : un message au client, le montant déjà écrit.</w:t>
+      </w:r>
+    </w:p>
+    <w:p>
+      <w:r>
+        <w:t xml:space="preserve">Une vente n'a qu'</w:t>
+      </w:r>
+      <w:r>
+        <w:rPr>
+          <w:b/>
+        </w:rPr>
+        <w:t xml:space="preserve">une</w:t>
+      </w:r>
+      <w:r>
+        <w:t xml:space="preserve"> facture : la redemander rouvre la même. Une vente à crédit est facturée d'office. Sa facture montre ce qui reste dû et son échéance, selon le délai de crédit du client. Une vente annulée ne peut plus être facturée, et sa facture passe « annulée ».</w:t>
+      </w:r>
+    </w:p>
+    <w:p>
+      <w:r>
+        <w:t xml:space="preserve">Pour retrouver les factures d'un client : </w:t>
+      </w:r>
+      <w:r>
+        <w:rPr>
+          <w:i/>
+        </w:rPr>
+        <w:t xml:space="preserve">Clients</w:t>
+      </w:r>
+      <w:r>
+        <w:t xml:space="preserve"> → lien </w:t>
+      </w:r>
+      <w:r>
+        <w:rPr>
+          <w:b/>
+        </w:rPr>
+        <w:t xml:space="preserve">Factures</w:t>
+      </w:r>
+      <w:r>
+        <w:t xml:space="preserve"> sous son nom, ou la recherche de la page </w:t>
+      </w:r>
+      <w:r>
+        <w:rPr>
+          <w:i/>
+        </w:rPr>
+        <w:t xml:space="preserve">Factures</w:t>
+      </w:r>
+      <w:r>
+        <w:t xml:space="preserve"> (numéro, nom ou téléphone).</w:t>
       </w:r>
     </w:p>
     <w:p>

</xml_diff>

<commit_message>
Écrans des commandes fournisseurs et des commandes professionnelles B2B
Achats : commande créée depuis les suggestions de réapprovisionnement
(groupées par fournisseur) ou à la main, prix repris du catalogue du
fournisseur ; transmission ; réceptions partielles successives avec lot et
péremption, entrée en stock immédiate.

B2B : commande ou devis pour un client professionnel (prix de gros, remise
par ligne), suivi des statuts, livraison et facture au comptant ou à crédit,
conversion d'un devis en commande.

Corrections : une livraison B2B d'un médicament sur ordonnance n'exige plus
d'ordonnance de patient ; une seconde réception sur la même commande n'est
plus ignorée (clé d'idempotence renouvelée) ; les formulaires dépliables ne
se referment plus après un ajout (composant Depliable).

Guide et README mis à jour ; 138 tests.

Co-Authored-By: Claude Opus 5.5 <noreply@anthropic.com>
Claude-Session: https://claude.ai/code/session_011SyBGTgTJHgxTnZbyUKDiB
</commit_message>
<xml_diff>
--- a/nova-pharma-os/docs/word/GUIDE_DEMARRAGE.docx
+++ b/nova-pharma-os/docs/word/GUIDE_DEMARRAGE.docx
@@ -2750,6 +2750,354 @@
     </w:p>
     <w:p>
       <w:pPr>
+        <w:pStyle w:val="Titre2"/>
+      </w:pPr>
+      <w:r>
+        <w:t xml:space="preserve">Commander à un fournisseur et réceptionner la livraison</w:t>
+      </w:r>
+    </w:p>
+    <w:p>
+      <w:r>
+        <w:t xml:space="preserve">Menu </w:t>
+      </w:r>
+      <w:r>
+        <w:rPr>
+          <w:i/>
+        </w:rPr>
+        <w:t xml:space="preserve">Achats</w:t>
+      </w:r>
+      <w:r>
+        <w:t xml:space="preserve">. Pour un achat payé et livré sur-le-champ, </w:t>
+      </w:r>
+      <w:r>
+        <w:rPr>
+          <w:i/>
+        </w:rPr>
+        <w:t xml:space="preserve">Stock et lots</w:t>
+      </w:r>
+      <w:r>
+        <w:t xml:space="preserve"> → </w:t>
+      </w:r>
+      <w:r>
+        <w:rPr>
+          <w:i/>
+        </w:rPr>
+        <w:t xml:space="preserve">Enregistrer un achat</w:t>
+      </w:r>
+      <w:r>
+        <w:t xml:space="preserve"> suffit ; la commande sert quand la marchandise arrive plus tard, ou en plusieurs fois.</w:t>
+      </w:r>
+    </w:p>
+    <w:p>
+      <w:r>
+        <w:rPr>
+          <w:b/>
+        </w:rPr>
+        <w:t xml:space="preserve">1. Partez des suggestions.</w:t>
+      </w:r>
+      <w:r>
+        <w:t xml:space="preserve"> En haut de la page, les produits qui vont manquer sont groupés par fournisseur : </w:t>
+      </w:r>
+      <w:r>
+        <w:rPr>
+          <w:b/>
+        </w:rPr>
+        <w:t xml:space="preserve">Commander chez …</w:t>
+      </w:r>
+      <w:r>
+        <w:t xml:space="preserve"> ouvre une commande déjà remplie, avec les quantités proposées. Sinon, </w:t>
+      </w:r>
+      <w:r>
+        <w:rPr>
+          <w:b/>
+        </w:rPr>
+        <w:t xml:space="preserve">Nouvelle commande fournisseur</w:t>
+      </w:r>
+      <w:r>
+        <w:t xml:space="preserve"> part d'une page blanche.</w:t>
+      </w:r>
+    </w:p>
+    <w:p>
+      <w:r>
+        <w:rPr>
+          <w:b/>
+        </w:rPr>
+        <w:t xml:space="preserve">2. Vérifiez la commande.</w:t>
+      </w:r>
+      <w:r>
+        <w:t xml:space="preserve"> Choisissez le fournisseur, puis chaque produit et sa quantité. Le prix unitaire est repris de </w:t>
+      </w:r>
+      <w:r>
+        <w:rPr>
+          <w:b/>
+        </w:rPr>
+        <w:t xml:space="preserve">son catalogue</w:t>
+      </w:r>
+      <w:r>
+        <w:t xml:space="preserve"> quand il y figure, sinon du prix d'achat habituel du produit ; il reste modifiable. </w:t>
+      </w:r>
+      <w:r>
+        <w:rPr>
+          <w:i/>
+        </w:rPr>
+        <w:t xml:space="preserve">Créer la commande</w:t>
+      </w:r>
+      <w:r>
+        <w:t xml:space="preserve"> l'enregistre en </w:t>
+      </w:r>
+      <w:r>
+        <w:rPr>
+          <w:b/>
+        </w:rPr>
+        <w:t xml:space="preserve">brouillon</w:t>
+      </w:r>
+      <w:r>
+        <w:t xml:space="preserve">.</w:t>
+      </w:r>
+    </w:p>
+    <w:p>
+      <w:r>
+        <w:rPr>
+          <w:b/>
+        </w:rPr>
+        <w:t xml:space="preserve">3. Transmettez-la.</w:t>
+      </w:r>
+      <w:r>
+        <w:t xml:space="preserve"> Envoyez-la au fournisseur comme d'habitude (téléphone, WhatsApp, réquisition PDF), puis </w:t>
+      </w:r>
+      <w:r>
+        <w:rPr>
+          <w:b/>
+        </w:rPr>
+        <w:t xml:space="preserve">Marquer comme transmise au fournisseur</w:t>
+      </w:r>
+      <w:r>
+        <w:t xml:space="preserve">.</w:t>
+      </w:r>
+    </w:p>
+    <w:p>
+      <w:r>
+        <w:rPr>
+          <w:b/>
+        </w:rPr>
+        <w:t xml:space="preserve">4. Réceptionnez.</w:t>
+      </w:r>
+      <w:r>
+        <w:t xml:space="preserve"> À la livraison, ouvrez la commande : chaque produit propose la quantité qui reste à recevoir. Corrigez-la si le fournisseur livre moins, saisissez le </w:t>
+      </w:r>
+      <w:r>
+        <w:rPr>
+          <w:b/>
+        </w:rPr>
+        <w:t xml:space="preserve">lot</w:t>
+      </w:r>
+      <w:r>
+        <w:t xml:space="preserve"> et la </w:t>
+      </w:r>
+      <w:r>
+        <w:rPr>
+          <w:b/>
+        </w:rPr>
+        <w:t xml:space="preserve">date de péremption</w:t>
+      </w:r>
+      <w:r>
+        <w:t xml:space="preserve"> (obligatoires pour un médicament qui périme) et, si vous l'avez, le numéro de sa facture. </w:t>
+      </w:r>
+      <w:r>
+        <w:rPr>
+          <w:b/>
+        </w:rPr>
+        <w:t xml:space="preserve">Enregistrer la réception</w:t>
+      </w:r>
+      <w:r>
+        <w:t xml:space="preserve"> fait entrer la marchandise en stock aussitôt. La commande passe « reçue en partie » — le reste reste proposé pour la livraison suivante — puis « reçue ». La liste des réceptions garde chaque livraison.</w:t>
+      </w:r>
+    </w:p>
+    <w:p>
+      <w:pPr>
+        <w:pStyle w:val="Titre2"/>
+      </w:pPr>
+      <w:r>
+        <w:t xml:space="preserve">Vendre aux professionnels : commandes et devis</w:t>
+      </w:r>
+    </w:p>
+    <w:p>
+      <w:r>
+        <w:t xml:space="preserve">Menu </w:t>
+      </w:r>
+      <w:r>
+        <w:rPr>
+          <w:i/>
+        </w:rPr>
+        <w:t xml:space="preserve">Commandes B2B</w:t>
+      </w:r>
+      <w:r>
+        <w:t xml:space="preserve">, pour les cliniques, ONG et autres pharmacies enregistrées comme </w:t>
+      </w:r>
+      <w:r>
+        <w:rPr>
+          <w:b/>
+        </w:rPr>
+        <w:t xml:space="preserve">clients professionnels</w:t>
+      </w:r>
+      <w:r>
+        <w:t xml:space="preserve"> (</w:t>
+      </w:r>
+      <w:r>
+        <w:rPr>
+          <w:i/>
+        </w:rPr>
+        <w:t xml:space="preserve">Clients</w:t>
+      </w:r>
+      <w:r>
+        <w:t xml:space="preserve"> → </w:t>
+      </w:r>
+      <w:r>
+        <w:rPr>
+          <w:i/>
+        </w:rPr>
+        <w:t xml:space="preserve">Ajouter un client</w:t>
+      </w:r>
+      <w:r>
+        <w:t xml:space="preserve"> → professionnel).</w:t>
+      </w:r>
+    </w:p>
+    <w:p>
+      <w:r>
+        <w:rPr>
+          <w:b/>
+        </w:rPr>
+        <w:t xml:space="preserve">1. Établissez un devis ou une commande.</w:t>
+      </w:r>
+      <w:r>
+        <w:t xml:space="preserve"> </w:t>
+      </w:r>
+      <w:r>
+        <w:rPr>
+          <w:b/>
+        </w:rPr>
+        <w:t xml:space="preserve">Nouvelle commande ou devis</w:t>
+      </w:r>
+      <w:r>
+        <w:t xml:space="preserve"> : choisissez le document, le client, puis les produits. Le prix proposé est le </w:t>
+      </w:r>
+      <w:r>
+        <w:rPr>
+          <w:b/>
+        </w:rPr>
+        <w:t xml:space="preserve">prix de gros</w:t>
+      </w:r>
+      <w:r>
+        <w:t xml:space="preserve"> du produit (à défaut son prix de vente), avec une remise en % par ligne si vous le souhaitez. Une commande se règle </w:t>
+      </w:r>
+      <w:r>
+        <w:rPr>
+          <w:b/>
+        </w:rPr>
+        <w:t xml:space="preserve">comptant à la livraison</w:t>
+      </w:r>
+      <w:r>
+        <w:t xml:space="preserve"> ou </w:t>
+      </w:r>
+      <w:r>
+        <w:rPr>
+          <w:b/>
+        </w:rPr>
+        <w:t xml:space="preserve">à crédit</w:t>
+      </w:r>
+      <w:r>
+        <w:t xml:space="preserve">, dans la limite du plafond du client. Un médicament sur ordonnance peut être livré à un professionnel sans ordonnance de patient ; au comptoir, l'ordonnance reste exigée.</w:t>
+      </w:r>
+    </w:p>
+    <w:p>
+      <w:r>
+        <w:rPr>
+          <w:b/>
+        </w:rPr>
+        <w:t xml:space="preserve">2. Faites-la avancer.</w:t>
+      </w:r>
+      <w:r>
+        <w:t xml:space="preserve"> Sur la page de la commande : </w:t>
+      </w:r>
+      <w:r>
+        <w:rPr>
+          <w:i/>
+        </w:rPr>
+        <w:t xml:space="preserve">Confirmer</w:t>
+      </w:r>
+      <w:r>
+        <w:t xml:space="preserve">, </w:t>
+      </w:r>
+      <w:r>
+        <w:rPr>
+          <w:i/>
+        </w:rPr>
+        <w:t xml:space="preserve">Mettre en préparation</w:t>
+      </w:r>
+      <w:r>
+        <w:t xml:space="preserve">, </w:t>
+      </w:r>
+      <w:r>
+        <w:rPr>
+          <w:i/>
+        </w:rPr>
+        <w:t xml:space="preserve">Marquer prête</w:t>
+      </w:r>
+      <w:r>
+        <w:t xml:space="preserve"> — ou </w:t>
+      </w:r>
+      <w:r>
+        <w:rPr>
+          <w:i/>
+        </w:rPr>
+        <w:t xml:space="preserve">Annuler</w:t>
+      </w:r>
+      <w:r>
+        <w:t xml:space="preserve">.</w:t>
+      </w:r>
+    </w:p>
+    <w:p>
+      <w:r>
+        <w:rPr>
+          <w:b/>
+        </w:rPr>
+        <w:t xml:space="preserve">3. Livrez et facturez.</w:t>
+      </w:r>
+      <w:r>
+        <w:t xml:space="preserve"> </w:t>
+      </w:r>
+      <w:r>
+        <w:rPr>
+          <w:b/>
+        </w:rPr>
+        <w:t xml:space="preserve">Livrer et facturer</w:t>
+      </w:r>
+      <w:r>
+        <w:t xml:space="preserve"> sort les produits du stock (lots qui périment le plus tôt d'abord) et établit la facture. Au comptant, choisissez le moyen de règlement (espèces, Mobile Money avec sa référence, virement) : la facture est « réglée ». À crédit, la somme s'ajoute à l'encours du client et la facture reste « à régler » jusqu'à son paiement (voir plus bas). La facture s'imprime et se partage comme celle d'un client du comptoir.</w:t>
+      </w:r>
+    </w:p>
+    <w:p>
+      <w:r>
+        <w:rPr>
+          <w:b/>
+        </w:rPr>
+        <w:t xml:space="preserve">4. Un devis accepté devient une commande</w:t>
+      </w:r>
+      <w:r>
+        <w:t xml:space="preserve"> d'un clic : </w:t>
+      </w:r>
+      <w:r>
+        <w:rPr>
+          <w:b/>
+        </w:rPr>
+        <w:t xml:space="preserve">Transformer en commande</w:t>
+      </w:r>
+      <w:r>
+        <w:t xml:space="preserve">, sans rien ressaisir.</w:t>
+      </w:r>
+    </w:p>
+    <w:p>
+      <w:pPr>
         <w:pBdr>
           <w:bottom w:val="single" w:sz="6" w:space="6" w:color="CFE0DA"/>
         </w:pBdr>
@@ -5452,6 +5800,96 @@
       </w:r>
       <w:r>
         <w:t xml:space="preserve"> la deuxième est refusée, avec le numéro de l'encaissement déjà enregistré. C'est ce qui protège votre caisse.</w:t>
+      </w:r>
+    </w:p>
+    <w:p>
+      <w:pPr>
+        <w:pStyle w:val="Liste"/>
+        <w:numPr>
+          <w:ilvl w:val="0"/>
+          <w:numId w:val="2"/>
+        </w:numPr>
+      </w:pPr>
+      <w:r>
+        <w:rPr>
+          <w:b/>
+        </w:rPr>
+        <w:t xml:space="preserve">Commander et réceptionner</w:t>
+      </w:r>
+      <w:r>
+        <w:t xml:space="preserve"> — Menu </w:t>
+      </w:r>
+      <w:r>
+        <w:rPr>
+          <w:i/>
+        </w:rPr>
+        <w:t xml:space="preserve">Achats</w:t>
+      </w:r>
+      <w:r>
+        <w:t xml:space="preserve">, </w:t>
+      </w:r>
+      <w:r>
+        <w:rPr>
+          <w:i/>
+        </w:rPr>
+        <w:t xml:space="preserve">Commander chez …</w:t>
+      </w:r>
+      <w:r>
+        <w:t xml:space="preserve"> sous les suggestions, créez la commande, transmettez-la, puis réceptionnez la moitié des quantités. → </w:t>
+      </w:r>
+      <w:r>
+        <w:rPr>
+          <w:i/>
+        </w:rPr>
+        <w:t xml:space="preserve">Observez :</w:t>
+      </w:r>
+      <w:r>
+        <w:t xml:space="preserve"> le stock augmente aussitôt ; le reste attend la livraison suivante, et la commande est « reçue en partie ».</w:t>
+      </w:r>
+    </w:p>
+    <w:p>
+      <w:pPr>
+        <w:pStyle w:val="Liste"/>
+        <w:numPr>
+          <w:ilvl w:val="0"/>
+          <w:numId w:val="2"/>
+        </w:numPr>
+      </w:pPr>
+      <w:r>
+        <w:rPr>
+          <w:b/>
+        </w:rPr>
+        <w:t xml:space="preserve">Livrer une clinique</w:t>
+      </w:r>
+      <w:r>
+        <w:t xml:space="preserve"> — Menu </w:t>
+      </w:r>
+      <w:r>
+        <w:rPr>
+          <w:i/>
+        </w:rPr>
+        <w:t xml:space="preserve">Commandes B2B</w:t>
+      </w:r>
+      <w:r>
+        <w:t xml:space="preserve">, une commande pour « Clinique du Lac », confirmez-la, puis </w:t>
+      </w:r>
+      <w:r>
+        <w:rPr>
+          <w:i/>
+        </w:rPr>
+        <w:t xml:space="preserve">Livrer et facturer</w:t>
+      </w:r>
+      <w:r>
+        <w:t xml:space="preserve">. → </w:t>
+      </w:r>
+      <w:r>
+        <w:rPr>
+          <w:i/>
+        </w:rPr>
+        <w:t xml:space="preserve">Observez :</w:t>
+      </w:r>
+      <w:r>
+        <w:t xml:space="preserve"> la facture est établie et le stock a baissé.</w:t>
       </w:r>
     </w:p>
     <w:p>

</xml_diff>

<commit_message>
Ticket de caisse sur imprimante thermique (58 ou 80 mm)
Page /ticket/:id hors du cadre de l'application : en-tête de la pharmacie,
articles regroupés par produit, total et taxes, part du tiers payant et
bénéficiaire, règlements dans leur devise avec le taux, monnaie rendue.
Bouton « Imprimer le ticket » à la caisse après chaque vente et sur la page
d'une vente : le ticket s'ouvre et l'impression part ; la largeur est
retenue sur le poste. La page d'impression est mesurée à la hauteur exacte
du ticket (une hauteur « auto » n'est pas comprise des navigateurs) : un
ticket, une page, le rouleau n'avance que du nécessaire.

Le reçu de l'API indique l'organisme et le bénéficiaire du tiers payant.
Vérifié : tickets 80 et 58 mm imprimés en PDF, une page chacun. 174 tests.

Co-Authored-By: Claude Opus 5.5 <noreply@anthropic.com>
Claude-Session: https://claude.ai/code/session_011SyBGTgTJHgxTnZbyUKDiB
</commit_message>
<xml_diff>
--- a/nova-pharma-os/docs/word/GUIDE_DEMARRAGE.docx
+++ b/nova-pharma-os/docs/word/GUIDE_DEMARRAGE.docx
@@ -5259,6 +5259,60 @@
         </w:pBdr>
         <w:spacing w:before="200" w:after="200"/>
       </w:pPr>
+    </w:p>
+    <w:p>
+      <w:pPr>
+        <w:pStyle w:val="Titre2"/>
+      </w:pPr>
+      <w:r>
+        <w:t xml:space="preserve">Imprimer le ticket de caisse</w:t>
+      </w:r>
+    </w:p>
+    <w:p>
+      <w:r>
+        <w:t xml:space="preserve">Après chaque vente, </w:t>
+      </w:r>
+      <w:r>
+        <w:rPr>
+          <w:b/>
+        </w:rPr>
+        <w:t xml:space="preserve">Imprimer le ticket</w:t>
+      </w:r>
+      <w:r>
+        <w:t xml:space="preserve"> ouvre le ticket et lance l'impression. La première fois, choisissez la largeur de votre imprimante de comptoir — </w:t>
+      </w:r>
+      <w:r>
+        <w:rPr>
+          <w:b/>
+        </w:rPr>
+        <w:t xml:space="preserve">58 mm</w:t>
+      </w:r>
+      <w:r>
+        <w:t xml:space="preserve"> ou </w:t>
+      </w:r>
+      <w:r>
+        <w:rPr>
+          <w:b/>
+        </w:rPr>
+        <w:t xml:space="preserve">80 mm</w:t>
+      </w:r>
+      <w:r>
+        <w:t xml:space="preserve"> — puis, dans la fenêtre d'impression, l'imprimante thermique. La largeur est retenue sur ce poste. Le ticket d'une vente passée se réimprime depuis sa page (</w:t>
+      </w:r>
+      <w:r>
+        <w:rPr>
+          <w:i/>
+        </w:rPr>
+        <w:t xml:space="preserve">Factures</w:t>
+      </w:r>
+      <w:r>
+        <w:t xml:space="preserve"> → la vente).</w:t>
+      </w:r>
+    </w:p>
+    <w:p>
+      <w:r>
+        <w:t xml:space="preserve">Le ticket indique la pharmacie, les articles, le total, les règlements dans leur devise (« 10 000 FC », avec le taux), la monnaie rendue et, pour un membre de mutuelle, la part de l'organisme et celle du patient. Sur un téléphone Android relié à une petite imprimante Bluetooth, une application gratuite comme RawBT sert d'imprimante pour le navigateur.</w:t>
+      </w:r>
     </w:p>
     <w:p>
       <w:pPr>

</xml_diff>

<commit_message>
Rappels WhatsApp aux malades chroniques (traitements suivis)
- Migration 026 : treatment_plans (patient, médicament, maladie, jours par
  unité, avance du rappel, dernière délivrance, date de fin).
- API /treatments : liste avec état (à prévenir, boîte finie, en cours,
  arrêté), suivi, modification, arrêt, rappel par la messagerie (lien wa.me
  gratuit en mode manuel). Chaque vente au patient recalcule la date de fin
  au fuseau de la pharmacie et efface le rappel précédent.
- Page Traitements suivis : patients à prévenir avec bouton WhatsApp,
  liste complète, formulaire d'ajout ; menu traduit en 15 langues.
- Tests : traitements.e2e-spec.ts (179 tests) ; README et guide à jour.

Co-Authored-By: Claude Opus 5.5 <noreply@anthropic.com>
Claude-Session: https://claude.ai/code/session_011SyBGTgTJHgxTnZbyUKDiB
</commit_message>
<xml_diff>
--- a/nova-pharma-os/docs/word/GUIDE_DEMARRAGE.docx
+++ b/nova-pharma-os/docs/word/GUIDE_DEMARRAGE.docx
@@ -5771,6 +5771,129 @@
     <w:p>
       <w:r>
         <w:t xml:space="preserve">Une vente annulée sort d'elle-même d'un relevé encore en brouillon. Une fois le relevé présenté, il faut d'abord l'annuler (tant qu'il n'est pas réglé).</w:t>
+      </w:r>
+    </w:p>
+    <w:p>
+      <w:pPr>
+        <w:pStyle w:val="Titre2"/>
+      </w:pPr>
+      <w:r>
+        <w:t xml:space="preserve">Prévenir les malades chroniques avant la fin de leur traitement</w:t>
+      </w:r>
+    </w:p>
+    <w:p>
+      <w:r>
+        <w:t xml:space="preserve">Menu </w:t>
+      </w:r>
+      <w:r>
+        <w:rPr>
+          <w:i/>
+        </w:rPr>
+        <w:t xml:space="preserve">Traitements suivis</w:t>
+      </w:r>
+      <w:r>
+        <w:t xml:space="preserve">. Un patient diabétique, hypertendu ou sous antirétroviraux revient chaque mois : le prévenir quelques jours avant la fin de sa boîte l'aide à ne pas interrompre son traitement — et le fait revenir chez vous plutôt que chez le voisin.</w:t>
+      </w:r>
+    </w:p>
+    <w:p>
+      <w:r>
+        <w:rPr>
+          <w:b/>
+        </w:rPr>
+        <w:t xml:space="preserve">1. Suivez le traitement</w:t>
+      </w:r>
+      <w:r>
+        <w:t xml:space="preserve"> : </w:t>
+      </w:r>
+      <w:r>
+        <w:rPr>
+          <w:i/>
+        </w:rPr>
+        <w:t xml:space="preserve">Suivre le traitement d'un patient</w:t>
+      </w:r>
+      <w:r>
+        <w:t xml:space="preserve">, choisissez le patient (il doit exister dans </w:t>
+      </w:r>
+      <w:r>
+        <w:rPr>
+          <w:i/>
+        </w:rPr>
+        <w:t xml:space="preserve">Clients</w:t>
+      </w:r>
+      <w:r>
+        <w:t xml:space="preserve">, avec son téléphone) et le médicament, la maladie, et combien de jours dure une boîte (30 comprimés à un par jour : 30). Indiquez la date de la dernière délivrance et le nombre de boîtes : NOVA calcule la date de fin.</w:t>
+      </w:r>
+    </w:p>
+    <w:p>
+      <w:r>
+        <w:rPr>
+          <w:b/>
+        </w:rPr>
+        <w:t xml:space="preserve">2. Ensuite, rien à faire</w:t>
+      </w:r>
+      <w:r>
+        <w:t xml:space="preserve"> : à chaque vente de ce médicament à ce patient (choisissez-le à la caisse), la date de fin se recalcule toute seule.</w:t>
+      </w:r>
+    </w:p>
+    <w:p>
+      <w:r>
+        <w:rPr>
+          <w:b/>
+        </w:rPr>
+        <w:t xml:space="preserve">3. Chaque matin</w:t>
+      </w:r>
+      <w:r>
+        <w:t xml:space="preserve">, ouvrez </w:t>
+      </w:r>
+      <w:r>
+        <w:rPr>
+          <w:i/>
+        </w:rPr>
+        <w:t xml:space="preserve">Traitements suivis</w:t>
+      </w:r>
+      <w:r>
+        <w:t xml:space="preserve"> : la liste </w:t>
+      </w:r>
+      <w:r>
+        <w:rPr>
+          <w:b/>
+        </w:rPr>
+        <w:t xml:space="preserve">À prévenir</w:t>
+      </w:r>
+      <w:r>
+        <w:t xml:space="preserve"> montre les boîtes qui finissent dans les 3 jours (réglable) et celles déjà finies. Touchez </w:t>
+      </w:r>
+      <w:r>
+        <w:rPr>
+          <w:b/>
+        </w:rPr>
+        <w:t xml:space="preserve">Prévenir sur WhatsApp</w:t>
+      </w:r>
+      <w:r>
+        <w:t xml:space="preserve">, puis </w:t>
+      </w:r>
+      <w:r>
+        <w:rPr>
+          <w:b/>
+        </w:rPr>
+        <w:t xml:space="preserve">Ouvrir WhatsApp</w:t>
+      </w:r>
+      <w:r>
+        <w:t xml:space="preserve"> : le message est prêt, envoyez-le depuis le WhatsApp de la pharmacie. Aucun frais de SMS. Le patient est alors marqué « prévenu ».</w:t>
+      </w:r>
+    </w:p>
+    <w:p>
+      <w:r>
+        <w:t xml:space="preserve">Un patient qui arrête son traitement : </w:t>
+      </w:r>
+      <w:r>
+        <w:rPr>
+          <w:b/>
+        </w:rPr>
+        <w:t xml:space="preserve">Arrêter</w:t>
+      </w:r>
+      <w:r>
+        <w:t xml:space="preserve">. Il ne sera plus rappelé.</w:t>
       </w:r>
     </w:p>
     <w:p>

</xml_diff>

<commit_message>
Place de marché entre pharmacies et dépôts
- Migration 032 : market_sellers, market_offers, market_orders, avec des
  politiques RLS écrites explicitement : offres actives d'un vendeur
  publié et sa fiche lisibles de toutes les pharmacies ; commande visible
  et modifiable par l'acheteur et le vendeur seuls.
- API /market : fiche vendeur, offres (reliées ou non au catalogue,
  disponibilité et péremption recalculées depuis le stock), recherche par
  produit et ville, commande par vendeur (minimums contrôlés, lien
  WhatsApp), acceptation qui crée la commande professionnelle chez le
  vendeur, expédition, refus motivé, annulation, réception en stock chez
  l'acheteur au prix de la commande.
- Page Place de marché (Acheter, Mes commandes, Commandes reçues,
  Vendre) ; menu en 15 langues.
- Tests : place-de-marche.e2e-spec.ts (224 tests) ; README et guide.

Co-Authored-By: Claude Opus 5.5 <noreply@anthropic.com>
Claude-Session: https://claude.ai/code/session_011SyBGTgTJHgxTnZbyUKDiB
</commit_message>
<xml_diff>
--- a/nova-pharma-os/docs/word/GUIDE_DEMARRAGE.docx
+++ b/nova-pharma-os/docs/word/GUIDE_DEMARRAGE.docx
@@ -5894,6 +5894,118 @@
       </w:r>
       <w:r>
         <w:t xml:space="preserve">. Il ne sera plus rappelé.</w:t>
+      </w:r>
+    </w:p>
+    <w:p>
+      <w:pPr>
+        <w:pStyle w:val="Titre2"/>
+      </w:pPr>
+      <w:r>
+        <w:t xml:space="preserve">Acheter et vendre sur la place de marché</w:t>
+      </w:r>
+    </w:p>
+    <w:p>
+      <w:r>
+        <w:t xml:space="preserve">Menu </w:t>
+      </w:r>
+      <w:r>
+        <w:rPr>
+          <w:i/>
+        </w:rPr>
+        <w:t xml:space="preserve">Place de marché</w:t>
+      </w:r>
+      <w:r>
+        <w:t xml:space="preserve">.</w:t>
+      </w:r>
+    </w:p>
+    <w:p>
+      <w:r>
+        <w:rPr>
+          <w:b/>
+        </w:rPr>
+        <w:t xml:space="preserve">Acheter</w:t>
+      </w:r>
+      <w:r>
+        <w:t xml:space="preserve"> : tapez un produit (et votre ville si vous voulez un vendeur qui livre chez vous). Les offres des dépôts et des autres pharmacies s'affichent, de la moins chère à la plus chère, avec la disponibilité et la péremption annoncée. </w:t>
+      </w:r>
+      <w:r>
+        <w:rPr>
+          <w:b/>
+        </w:rPr>
+        <w:t xml:space="preserve">Ajouter</w:t>
+      </w:r>
+      <w:r>
+        <w:t xml:space="preserve"> les produits voulus, puis </w:t>
+      </w:r>
+      <w:r>
+        <w:rPr>
+          <w:b/>
+        </w:rPr>
+        <w:t xml:space="preserve">Envoyer la commande</w:t>
+      </w:r>
+      <w:r>
+        <w:t xml:space="preserve"> au vendeur, et prévenez-le d'un clic sur WhatsApp. Suivez-la dans </w:t>
+      </w:r>
+      <w:r>
+        <w:rPr>
+          <w:i/>
+        </w:rPr>
+        <w:t xml:space="preserve">Mes commandes</w:t>
+      </w:r>
+      <w:r>
+        <w:t xml:space="preserve"> ; à la livraison, </w:t>
+      </w:r>
+      <w:r>
+        <w:rPr>
+          <w:b/>
+        </w:rPr>
+        <w:t xml:space="preserve">Réceptionner</w:t>
+      </w:r>
+      <w:r>
+        <w:t xml:space="preserve"> : choisissez le produit de votre catalogue, le lot et la péremption, et le stock entre au prix de la commande.</w:t>
+      </w:r>
+    </w:p>
+    <w:p>
+      <w:r>
+        <w:rPr>
+          <w:b/>
+        </w:rPr>
+        <w:t xml:space="preserve">Vendre</w:t>
+      </w:r>
+      <w:r>
+        <w:t xml:space="preserve"> (dépôt, ou pharmacie qui écoule un surplus) : publiez votre fiche (ville, zones de livraison, minimum de commande), puis vos offres. Une offre reliée à un produit de votre catalogue se met à jour depuis votre stock. Les commandes arrivent dans </w:t>
+      </w:r>
+      <w:r>
+        <w:rPr>
+          <w:i/>
+        </w:rPr>
+        <w:t xml:space="preserve">Commandes reçues</w:t>
+      </w:r>
+      <w:r>
+        <w:t xml:space="preserve"> : </w:t>
+      </w:r>
+      <w:r>
+        <w:rPr>
+          <w:b/>
+        </w:rPr>
+        <w:t xml:space="preserve">Accepter</w:t>
+      </w:r>
+      <w:r>
+        <w:t xml:space="preserve"> crée la commande professionnelle dans votre NOVA (préparation, sortie de stock, facture comme d'habitude), puis </w:t>
+      </w:r>
+      <w:r>
+        <w:rPr>
+          <w:b/>
+        </w:rPr>
+        <w:t xml:space="preserve">Expédiée</w:t>
+      </w:r>
+      <w:r>
+        <w:t xml:space="preserve">.</w:t>
+      </w:r>
+    </w:p>
+    <w:p>
+      <w:r>
+        <w:t xml:space="preserve">Le règlement se fait entre vous, comme d'habitude : NOVA ne prend aucune commission.</w:t>
       </w:r>
     </w:p>
     <w:p>

</xml_diff>

<commit_message>
Alertes d'interactions médicamenteuses à la caisse
- Migration 033 : classes thérapeutiques et interactions de référence
  (15 classes, 23 associations classées selon le Thésaurus ANSM), lisibles
  par toutes les pharmacies, tenues par le back-office.
- La caisse signale les associations entre produits du ticket et avec les
  traitements suivis du client ; l'alerte informe sans bloquer la vente.
- Reconnaissance par nom, DCI, dosage et molécule reliée, mot entier et
  sans accents (pas de fausse alerte sur un mot voisin).
- Pages Interactions (pharmacie : consultation ; back-office : ajout,
  désactivation, import CSV), journalisées dans l'audit de la plateforme.
- Les actions sur les alertes produits du back-office sont désormais
  journalisées (audit.recordPlatform).
- 7 tests de bout en bout ; 231 au total.

Co-Authored-By: Claude Opus 5.5 <noreply@anthropic.com>
Claude-Session: https://claude.ai/code/session_011SyBGTgTJHgxTnZbyUKDiB
</commit_message>
<xml_diff>
--- a/nova-pharma-os/docs/word/GUIDE_DEMARRAGE.docx
+++ b/nova-pharma-os/docs/word/GUIDE_DEMARRAGE.docx
@@ -6006,6 +6006,56 @@
     <w:p>
       <w:r>
         <w:t xml:space="preserve">Le règlement se fait entre vous, comme d'habitude : NOVA ne prend aucune commission.</w:t>
+      </w:r>
+    </w:p>
+    <w:p>
+      <w:pPr>
+        <w:pStyle w:val="Titre2"/>
+      </w:pPr>
+      <w:r>
+        <w:t xml:space="preserve">Être prévenu des interactions entre médicaments</w:t>
+      </w:r>
+    </w:p>
+    <w:p>
+      <w:r>
+        <w:t xml:space="preserve">Rien à régler : à la </w:t>
+      </w:r>
+      <w:r>
+        <w:rPr>
+          <w:b/>
+        </w:rPr>
+        <w:t xml:space="preserve">caisse</w:t>
+      </w:r>
+      <w:r>
+        <w:t xml:space="preserve">, dès que deux médicaments du ticket ne vont pas bien ensemble (par exemple un anticoagulant comme la warfarine et un anti-inflammatoire comme l'ibuprofène), un encadré rouge ou orange l'annonce, avec la conduite à tenir. Si vous choisissez le client et qu'il a un traitement suivi (menu </w:t>
+      </w:r>
+      <w:r>
+        <w:rPr>
+          <w:i/>
+        </w:rPr>
+        <w:t xml:space="preserve">Traitements suivis</w:t>
+      </w:r>
+      <w:r>
+        <w:t xml:space="preserve">), NOVA le compare aussi au ticket.</w:t>
+      </w:r>
+    </w:p>
+    <w:p>
+      <w:r>
+        <w:t xml:space="preserve">L'alerte ne bloque pas la vente : elle vous informe, vous décidez. Pour qu'un produit au nom commercial soit reconnu, renseignez sa DCI (la molécule) dans le catalogue.</w:t>
+      </w:r>
+    </w:p>
+    <w:p>
+      <w:r>
+        <w:t xml:space="preserve">Menu </w:t>
+      </w:r>
+      <w:r>
+        <w:rPr>
+          <w:i/>
+        </w:rPr>
+        <w:t xml:space="preserve">Interactions</w:t>
+      </w:r>
+      <w:r>
+        <w:t xml:space="preserve"> : consultez la liste, cherchez une substance. Elle est courte et non exhaustive (les bases complètes sont payantes) ; NOVA PHARMA OS la complète au fil des besoins. Signalez au support une association qui manque.</w:t>
       </w:r>
     </w:p>
     <w:p>

</xml_diff>

<commit_message>
Rapport mensuel pour les programmes publics (LOGIMEV, DHIS2)
- Migration 034 : codes de la structure (programme, unité d'organisation
  et formulaire DHIS2, stock maximum) et correspondances par produit
  (code national, éléments de données DHIS2 par rubrique).
- Rapport mensuel de gestion des stocks calculé depuis le registre des
  mouvements, dans le fuseau de la pharmacie : stock initial, reçu,
  consommé, pertes, ajustements, stock final, jours de rupture,
  consommation moyenne et quantité à commander ; ligne toujours équilibrée.
- Export Excel (rubriques de la réquisition OpenLMIS en regard) et fichier
  DHIS2 dataValueSets à importer dans Import/Export ; import CSV des
  correspondances.
- Page Programmes publics. L'envoi direct à LOGIMEV attend l'accès et les
  codes du ministère : aucun format n'est supposé.
- 6 tests de bout en bout ; 237 au total.

Co-Authored-By: Claude Opus 5.5 <noreply@anthropic.com>
Claude-Session: https://claude.ai/code/session_011SyBGTgTJHgxTnZbyUKDiB
</commit_message>
<xml_diff>
--- a/nova-pharma-os/docs/word/GUIDE_DEMARRAGE.docx
+++ b/nova-pharma-os/docs/word/GUIDE_DEMARRAGE.docx
@@ -6056,6 +6056,104 @@
       </w:r>
       <w:r>
         <w:t xml:space="preserve"> : consultez la liste, cherchez une substance. Elle est courte et non exhaustive (les bases complètes sont payantes) ; NOVA PHARMA OS la complète au fil des besoins. Signalez au support une association qui manque.</w:t>
+      </w:r>
+    </w:p>
+    <w:p>
+      <w:pPr>
+        <w:pStyle w:val="Titre2"/>
+      </w:pPr>
+      <w:r>
+        <w:t xml:space="preserve">Envoyer le rapport mensuel aux programmes de santé</w:t>
+      </w:r>
+    </w:p>
+    <w:p>
+      <w:r>
+        <w:t xml:space="preserve">Menu </w:t>
+      </w:r>
+      <w:r>
+        <w:rPr>
+          <w:i/>
+        </w:rPr>
+        <w:t xml:space="preserve">Programmes publics</w:t>
+      </w:r>
+      <w:r>
+        <w:t xml:space="preserve">. Choisissez le mois : NOVA remplit le rapport mensuel de gestion des stocks à partir de vos ventes, réceptions et inventaires (stock initial, reçu, consommé, pertes, stock final, jours de rupture, quantité à commander). Rien à recompter à la main.</w:t>
+      </w:r>
+    </w:p>
+    <w:p>
+      <w:r>
+        <w:rPr>
+          <w:b/>
+        </w:rPr>
+        <w:t xml:space="preserve">Une seule fois</w:t>
+      </w:r>
+      <w:r>
+        <w:t xml:space="preserve"> : dans </w:t>
+      </w:r>
+      <w:r>
+        <w:rPr>
+          <w:i/>
+        </w:rPr>
+        <w:t xml:space="preserve">Codes de la structure</w:t>
+      </w:r>
+      <w:r>
+        <w:t xml:space="preserve">, saisissez le code que vous a donné la zone de santé ou le programme, et l'identifiant DHIS2 de votre structure si vous déclarez dans DHIS2. Puis reliez les produits suivis par le programme à leur code national (</w:t>
+      </w:r>
+      <w:r>
+        <w:rPr>
+          <w:i/>
+        </w:rPr>
+        <w:t xml:space="preserve">Relier un produit</w:t>
+      </w:r>
+      <w:r>
+        <w:t xml:space="preserve">, ou </w:t>
+      </w:r>
+      <w:r>
+        <w:rPr>
+          <w:i/>
+        </w:rPr>
+        <w:t xml:space="preserve">Importer</w:t>
+      </w:r>
+      <w:r>
+        <w:t xml:space="preserve"> si le programme vous a donné une liste).</w:t>
+      </w:r>
+    </w:p>
+    <w:p>
+      <w:r>
+        <w:rPr>
+          <w:b/>
+        </w:rPr>
+        <w:t xml:space="preserve">Chaque mois</w:t>
+      </w:r>
+      <w:r>
+        <w:t xml:space="preserve"> : </w:t>
+      </w:r>
+      <w:r>
+        <w:rPr>
+          <w:b/>
+        </w:rPr>
+        <w:t xml:space="preserve">Excel</w:t>
+      </w:r>
+      <w:r>
+        <w:t xml:space="preserve"> pour imprimer ou saisir le rapport ; </w:t>
+      </w:r>
+      <w:r>
+        <w:rPr>
+          <w:b/>
+        </w:rPr>
+        <w:t xml:space="preserve">Fichier DHIS2</w:t>
+      </w:r>
+      <w:r>
+        <w:t xml:space="preserve"> pour l'importer dans DHIS2 (</w:t>
+      </w:r>
+      <w:r>
+        <w:rPr>
+          <w:i/>
+        </w:rPr>
+        <w:t xml:space="preserve">Import/Export → Importation de données</w:t>
+      </w:r>
+      <w:r>
+        <w:t xml:space="preserve">, faites d'abord un essai). Pour LOGIMEV, l'accès est donné par le ministère de la Santé ; le classeur Excel reprend ses rubriques.</w:t>
       </w:r>
     </w:p>
     <w:p>

</xml_diff>